<commit_message>
Update U.S. Code Links
</commit_message>
<xml_diff>
--- a/USLM-2_0-Review-Guide-v2_0_12-changes.docx
+++ b/USLM-2_0-Review-Guide-v2_0_12-changes.docx
@@ -1,6 +1,6 @@
 
 <file path=word/document.xml><?xml version="1.0" encoding="utf-8"?>
-<w:document xmlns:wpc="http://schemas.microsoft.com/office/word/2010/wordprocessingCanvas" xmlns:cx="http://schemas.microsoft.com/office/drawing/2014/chartex" xmlns:cx1="http://schemas.microsoft.com/office/drawing/2015/9/8/chartex" xmlns:cx2="http://schemas.microsoft.com/office/drawing/2015/10/21/chartex" xmlns:cx3="http://schemas.microsoft.com/office/drawing/2016/5/9/chartex" xmlns:cx4="http://schemas.microsoft.com/office/drawing/2016/5/10/chartex" xmlns:cx5="http://schemas.microsoft.com/office/drawing/2016/5/11/chartex" xmlns:cx6="http://schemas.microsoft.com/office/drawing/2016/5/12/chartex" xmlns:cx7="http://schemas.microsoft.com/office/drawing/2016/5/13/chartex" xmlns:cx8="http://schemas.microsoft.com/office/drawing/2016/5/14/chartex" xmlns:mc="http://schemas.openxmlformats.org/markup-compatibility/2006" xmlns:aink="http://schemas.microsoft.com/office/drawing/2016/ink" xmlns:am3d="http://schemas.microsoft.com/office/drawing/2017/model3d" xmlns:o="urn:schemas-microsoft-com:office:office" xmlns:r="http://schemas.openxmlformats.org/officeDocument/2006/relationships" xmlns:m="http://schemas.openxmlformats.org/officeDocument/2006/math" xmlns:v="urn:schemas-microsoft-com:vml" xmlns:wp14="http://schemas.microsoft.com/office/word/2010/wordprocessingDrawing" xmlns:wp="http://schemas.openxmlformats.org/drawingml/2006/wordprocessingDrawing" xmlns:w10="urn:schemas-microsoft-com:office:word" xmlns:w="http://schemas.openxmlformats.org/wordprocessingml/2006/main" xmlns:w14="http://schemas.microsoft.com/office/word/2010/wordml" xmlns:w15="http://schemas.microsoft.com/office/word/2012/wordml" xmlns:w16cid="http://schemas.microsoft.com/office/word/2016/wordml/cid" xmlns:w16se="http://schemas.microsoft.com/office/word/2015/wordml/symex" xmlns:wpg="http://schemas.microsoft.com/office/word/2010/wordprocessingGroup" xmlns:wpi="http://schemas.microsoft.com/office/word/2010/wordprocessingInk" xmlns:wne="http://schemas.microsoft.com/office/word/2006/wordml" xmlns:wps="http://schemas.microsoft.com/office/word/2010/wordprocessingShape" mc:Ignorable="w14 w15 w16se w16cid wp14">
+<w:document xmlns:wpc="http://schemas.microsoft.com/office/word/2010/wordprocessingCanvas" xmlns:cx="http://schemas.microsoft.com/office/drawing/2014/chartex" xmlns:cx1="http://schemas.microsoft.com/office/drawing/2015/9/8/chartex" xmlns:cx2="http://schemas.microsoft.com/office/drawing/2015/10/21/chartex" xmlns:cx3="http://schemas.microsoft.com/office/drawing/2016/5/9/chartex" xmlns:cx4="http://schemas.microsoft.com/office/drawing/2016/5/10/chartex" xmlns:cx5="http://schemas.microsoft.com/office/drawing/2016/5/11/chartex" xmlns:cx6="http://schemas.microsoft.com/office/drawing/2016/5/12/chartex" xmlns:cx7="http://schemas.microsoft.com/office/drawing/2016/5/13/chartex" xmlns:cx8="http://schemas.microsoft.com/office/drawing/2016/5/14/chartex" xmlns:mc="http://schemas.openxmlformats.org/markup-compatibility/2006" xmlns:aink="http://schemas.microsoft.com/office/drawing/2016/ink" xmlns:am3d="http://schemas.microsoft.com/office/drawing/2017/model3d" xmlns:o="urn:schemas-microsoft-com:office:office" xmlns:oel="http://schemas.microsoft.com/office/2019/extlst" xmlns:r="http://schemas.openxmlformats.org/officeDocument/2006/relationships" xmlns:m="http://schemas.openxmlformats.org/officeDocument/2006/math" xmlns:v="urn:schemas-microsoft-com:vml" xmlns:wp14="http://schemas.microsoft.com/office/word/2010/wordprocessingDrawing" xmlns:wp="http://schemas.openxmlformats.org/drawingml/2006/wordprocessingDrawing" xmlns:w10="urn:schemas-microsoft-com:office:word" xmlns:w="http://schemas.openxmlformats.org/wordprocessingml/2006/main" xmlns:w14="http://schemas.microsoft.com/office/word/2010/wordml" xmlns:w15="http://schemas.microsoft.com/office/word/2012/wordml" xmlns:w16cex="http://schemas.microsoft.com/office/word/2018/wordml/cex" xmlns:w16cid="http://schemas.microsoft.com/office/word/2016/wordml/cid" xmlns:w16="http://schemas.microsoft.com/office/word/2018/wordml" xmlns:w16du="http://schemas.microsoft.com/office/word/2023/wordml/word16du" xmlns:w16sdtdh="http://schemas.microsoft.com/office/word/2020/wordml/sdtdatahash" xmlns:w16sdtfl="http://schemas.microsoft.com/office/word/2024/wordml/sdtformatlock" xmlns:w16se="http://schemas.microsoft.com/office/word/2015/wordml/symex" xmlns:wpg="http://schemas.microsoft.com/office/word/2010/wordprocessingGroup" xmlns:wpi="http://schemas.microsoft.com/office/word/2010/wordprocessingInk" xmlns:wne="http://schemas.microsoft.com/office/word/2006/wordml" xmlns:wps="http://schemas.microsoft.com/office/word/2010/wordprocessingShape" mc:Ignorable="w14 w15 w16se w16cid w16 w16cex w16sdtdh w16sdtfl w16du wp14">
   <w:body>
     <w:p>
       <w:pPr>
@@ -3343,14 +3343,74 @@
       <w:r>
         <w:t xml:space="preserve"> version of the United States Code for download at </w:t>
       </w:r>
-      <w:hyperlink r:id="rId8" w:history="1">
+      <w:r>
+        <w:fldChar w:fldCharType="begin"/>
+      </w:r>
+      <w:r>
+        <w:instrText>HYPERLINK "</w:instrText>
+      </w:r>
+      <w:r>
+        <w:instrText>https://uscode.house.gov/download.html</w:instrText>
+      </w:r>
+      <w:r>
+        <w:instrText>"</w:instrText>
+      </w:r>
+      <w:r>
+        <w:fldChar w:fldCharType="separate"/>
+      </w:r>
+      <w:r>
+        <w:rPr>
+          <w:rStyle w:val="Hyperlink"/>
+        </w:rPr>
+        <w:t>http</w:t>
+      </w:r>
+      <w:ins w:id="24" w:author="Author">
         <w:r>
           <w:rPr>
             <w:rStyle w:val="Hyperlink"/>
           </w:rPr>
-          <w:t>http://uscode.house.gov/download/download.shtml</w:t>
+          <w:t>s</w:t>
         </w:r>
-      </w:hyperlink>
+      </w:ins>
+      <w:r>
+        <w:rPr>
+          <w:rStyle w:val="Hyperlink"/>
+        </w:rPr>
+        <w:t>://uscode.house.gov/</w:t>
+      </w:r>
+      <w:del w:id="25" w:author="Author">
+        <w:r>
+          <w:rPr>
+            <w:rStyle w:val="Hyperlink"/>
+          </w:rPr>
+          <w:delText>download/</w:delText>
+        </w:r>
+      </w:del>
+      <w:r>
+        <w:rPr>
+          <w:rStyle w:val="Hyperlink"/>
+        </w:rPr>
+        <w:t>download.</w:t>
+      </w:r>
+      <w:del w:id="26" w:author="Author">
+        <w:r>
+          <w:rPr>
+            <w:rStyle w:val="Hyperlink"/>
+          </w:rPr>
+          <w:delText>s</w:delText>
+        </w:r>
+      </w:del>
+      <w:r>
+        <w:rPr>
+          <w:rStyle w:val="Hyperlink"/>
+        </w:rPr>
+        <w:t>html</w:t>
+      </w:r>
+      <w:ins w:id="27" w:author="Author">
+        <w:r>
+          <w:fldChar w:fldCharType="end"/>
+        </w:r>
+      </w:ins>
       <w:r>
         <w:t>. The USLM version of the U.S. Code is updated continuously as new laws are enacted.</w:t>
       </w:r>
@@ -3618,34 +3678,34 @@
       <w:pPr>
         <w:pStyle w:val="Heading1"/>
       </w:pPr>
-      <w:bookmarkStart w:id="24" w:name="_Toc361821678"/>
-      <w:bookmarkStart w:id="25" w:name="_Toc361823765"/>
-      <w:bookmarkStart w:id="26" w:name="_Toc361824290"/>
-      <w:bookmarkStart w:id="27" w:name="_Toc361933181"/>
-      <w:bookmarkStart w:id="28" w:name="_Ref515454592"/>
-      <w:bookmarkStart w:id="29" w:name="_Toc516835516"/>
-      <w:bookmarkStart w:id="30" w:name="_Toc362346087"/>
-      <w:bookmarkEnd w:id="24"/>
-      <w:bookmarkEnd w:id="25"/>
-      <w:bookmarkEnd w:id="26"/>
-      <w:bookmarkEnd w:id="27"/>
-      <w:r>
-        <w:t>Existing Documentation</w:t>
-      </w:r>
+      <w:bookmarkStart w:id="28" w:name="_Toc361821678"/>
+      <w:bookmarkStart w:id="29" w:name="_Toc361823765"/>
+      <w:bookmarkStart w:id="30" w:name="_Toc361824290"/>
+      <w:bookmarkStart w:id="31" w:name="_Toc361933181"/>
+      <w:bookmarkStart w:id="32" w:name="_Ref515454592"/>
+      <w:bookmarkStart w:id="33" w:name="_Toc516835516"/>
+      <w:bookmarkStart w:id="34" w:name="_Toc362346087"/>
       <w:bookmarkEnd w:id="28"/>
       <w:bookmarkEnd w:id="29"/>
-    </w:p>
-    <w:p>
-      <w:bookmarkStart w:id="31" w:name="_Toc361823759"/>
-      <w:bookmarkStart w:id="32" w:name="_Toc361824284"/>
-      <w:bookmarkStart w:id="33" w:name="_Toc361933175"/>
+      <w:bookmarkEnd w:id="30"/>
       <w:bookmarkEnd w:id="31"/>
+      <w:r>
+        <w:t>Existing Documentation</w:t>
+      </w:r>
       <w:bookmarkEnd w:id="32"/>
       <w:bookmarkEnd w:id="33"/>
+    </w:p>
+    <w:p>
+      <w:bookmarkStart w:id="35" w:name="_Toc361823759"/>
+      <w:bookmarkStart w:id="36" w:name="_Toc361824284"/>
+      <w:bookmarkStart w:id="37" w:name="_Toc361933175"/>
+      <w:bookmarkEnd w:id="35"/>
+      <w:bookmarkEnd w:id="36"/>
+      <w:bookmarkEnd w:id="37"/>
       <w:r>
         <w:t xml:space="preserve">User documentation for the 1.0 version of the schema can be found at </w:t>
       </w:r>
-      <w:hyperlink r:id="rId9" w:history="1">
+      <w:hyperlink r:id="rId8" w:history="1">
         <w:r>
           <w:rPr>
             <w:rStyle w:val="Hyperlink"/>
@@ -3656,7 +3716,7 @@
       <w:r>
         <w:t xml:space="preserve"> and </w:t>
       </w:r>
-      <w:hyperlink r:id="rId10" w:history="1">
+      <w:hyperlink r:id="rId9" w:history="1">
         <w:r>
           <w:rPr>
             <w:rStyle w:val="Hyperlink"/>
@@ -3672,7 +3732,7 @@
       <w:r>
         <w:t xml:space="preserve">The XSD schema and CSS stylesheets for online viewing can be downloaded at: </w:t>
       </w:r>
-      <w:hyperlink r:id="rId11" w:history="1">
+      <w:hyperlink r:id="rId10" w:history="1">
         <w:r>
           <w:rPr>
             <w:rStyle w:val="Hyperlink"/>
@@ -3683,7 +3743,7 @@
       <w:r>
         <w:t xml:space="preserve"> and </w:t>
       </w:r>
-      <w:hyperlink r:id="rId12" w:history="1">
+      <w:hyperlink r:id="rId11" w:history="1">
         <w:r>
           <w:rPr>
             <w:rStyle w:val="Hyperlink"/>
@@ -3711,7 +3771,7 @@
       <w:r>
         <w:t xml:space="preserve">Note: These resources and more are available on GPO’s Developers Hub at </w:t>
       </w:r>
-      <w:hyperlink r:id="rId13" w:history="1">
+      <w:hyperlink r:id="rId12" w:history="1">
         <w:r>
           <w:rPr>
             <w:rStyle w:val="Hyperlink"/>
@@ -3731,11 +3791,11 @@
       <w:pPr>
         <w:pStyle w:val="Heading1"/>
       </w:pPr>
-      <w:bookmarkStart w:id="34" w:name="_Toc516835517"/>
+      <w:bookmarkStart w:id="38" w:name="_Toc516835517"/>
       <w:r>
         <w:t>What Has Not Changed</w:t>
       </w:r>
-      <w:bookmarkEnd w:id="34"/>
+      <w:bookmarkEnd w:id="38"/>
     </w:p>
     <w:p>
       <w:r>
@@ -3936,19 +3996,19 @@
       <w:pPr>
         <w:pStyle w:val="Heading1"/>
       </w:pPr>
-      <w:bookmarkStart w:id="35" w:name="_Toc516835518"/>
-      <w:bookmarkEnd w:id="30"/>
+      <w:bookmarkStart w:id="39" w:name="_Toc516835518"/>
+      <w:bookmarkEnd w:id="34"/>
       <w:r>
         <w:t>Schema Changes</w:t>
       </w:r>
-      <w:bookmarkEnd w:id="35"/>
+      <w:bookmarkEnd w:id="39"/>
     </w:p>
     <w:p>
       <w:pPr>
         <w:pStyle w:val="Heading2"/>
         <w:ind w:left="540" w:hanging="540"/>
       </w:pPr>
-      <w:bookmarkStart w:id="36" w:name="_Toc516835519"/>
+      <w:bookmarkStart w:id="40" w:name="_Toc516835519"/>
       <w:r>
         <w:t xml:space="preserve">Changed </w:t>
       </w:r>
@@ -3958,7 +4018,7 @@
       <w:r>
         <w:t>s</w:t>
       </w:r>
-      <w:bookmarkEnd w:id="36"/>
+      <w:bookmarkEnd w:id="40"/>
       <w:r>
         <w:t xml:space="preserve"> </w:t>
       </w:r>
@@ -4002,7 +4062,7 @@
       <w:pPr>
         <w:pStyle w:val="Heading3"/>
       </w:pPr>
-      <w:bookmarkStart w:id="37" w:name="_Toc516835520"/>
+      <w:bookmarkStart w:id="41" w:name="_Toc516835520"/>
       <w:r>
         <w:t>Table</w:t>
       </w:r>
@@ -4015,7 +4075,7 @@
       <w:r>
         <w:t xml:space="preserve"> and Indexes</w:t>
       </w:r>
-      <w:bookmarkEnd w:id="37"/>
+      <w:bookmarkEnd w:id="41"/>
     </w:p>
     <w:p>
       <w:pPr>
@@ -4613,6 +4673,50 @@
             <wp:extent cx="5943600" cy="2102485"/>
             <wp:effectExtent l="0" t="0" r="0" b="0"/>
             <wp:docPr id="1" name="Picture 1"/>
+            <wp:cNvGraphicFramePr>
+              <a:graphicFrameLocks xmlns:a="http://schemas.openxmlformats.org/drawingml/2006/main" noChangeAspect="1"/>
+            </wp:cNvGraphicFramePr>
+            <a:graphic xmlns:a="http://schemas.openxmlformats.org/drawingml/2006/main">
+              <a:graphicData uri="http://schemas.openxmlformats.org/drawingml/2006/picture">
+                <pic:pic xmlns:pic="http://schemas.openxmlformats.org/drawingml/2006/picture">
+                  <pic:nvPicPr>
+                    <pic:cNvPr id="1" name=""/>
+                    <pic:cNvPicPr/>
+                  </pic:nvPicPr>
+                  <pic:blipFill>
+                    <a:blip r:embed="rId13"/>
+                    <a:stretch>
+                      <a:fillRect/>
+                    </a:stretch>
+                  </pic:blipFill>
+                  <pic:spPr>
+                    <a:xfrm>
+                      <a:off x="0" y="0"/>
+                      <a:ext cx="5943600" cy="2102485"/>
+                    </a:xfrm>
+                    <a:prstGeom prst="rect">
+                      <a:avLst/>
+                    </a:prstGeom>
+                  </pic:spPr>
+                </pic:pic>
+              </a:graphicData>
+            </a:graphic>
+          </wp:inline>
+        </w:drawing>
+      </w:r>
+    </w:p>
+    <w:p/>
+    <w:p>
+      <w:r>
+        <w:rPr>
+          <w:noProof/>
+          <w:lang w:val="en-CA" w:eastAsia="en-CA"/>
+        </w:rPr>
+        <w:drawing>
+          <wp:inline distT="0" distB="0" distL="0" distR="0" wp14:anchorId="243E41C0" wp14:editId="03AF5F17">
+            <wp:extent cx="5677231" cy="2362480"/>
+            <wp:effectExtent l="0" t="0" r="0" b="0"/>
+            <wp:docPr id="2" name="Picture 2"/>
             <wp:cNvGraphicFramePr>
               <a:graphicFrameLocks xmlns:a="http://schemas.openxmlformats.org/drawingml/2006/main" noChangeAspect="1"/>
             </wp:cNvGraphicFramePr>
@@ -4632,7 +4736,7 @@
                   <pic:spPr>
                     <a:xfrm>
                       <a:off x="0" y="0"/>
-                      <a:ext cx="5943600" cy="2102485"/>
+                      <a:ext cx="5687135" cy="2366601"/>
                     </a:xfrm>
                     <a:prstGeom prst="rect">
                       <a:avLst/>
@@ -4648,15 +4752,57 @@
     <w:p/>
     <w:p>
       <w:r>
+        <w:t>This same model</w:t>
+      </w:r>
+      <w:r>
+        <w:t xml:space="preserve">, using </w:t>
+      </w:r>
+      <w:r>
+        <w:t>items, designators, labels and targets</w:t>
+      </w:r>
+      <w:r>
+        <w:t>,</w:t>
+      </w:r>
+      <w:r>
+        <w:t xml:space="preserve"> is also used for indexes that are found in legislative publications, such as </w:t>
+      </w:r>
+      <w:r>
+        <w:t>the</w:t>
+      </w:r>
+      <w:r>
+        <w:t xml:space="preserve"> Popular Name Index. Below </w:t>
+      </w:r>
+      <w:r>
+        <w:t xml:space="preserve">is </w:t>
+      </w:r>
+      <w:r>
+        <w:t xml:space="preserve">an illustration of </w:t>
+      </w:r>
+      <w:r>
+        <w:t xml:space="preserve">how </w:t>
+      </w:r>
+      <w:r>
+        <w:t xml:space="preserve">the model </w:t>
+      </w:r>
+      <w:r>
+        <w:t xml:space="preserve">can be </w:t>
+      </w:r>
+      <w:r>
+        <w:t>used for an index.</w:t>
+      </w:r>
+    </w:p>
+    <w:p>
+      <w:r>
         <w:rPr>
           <w:noProof/>
           <w:lang w:val="en-CA" w:eastAsia="en-CA"/>
         </w:rPr>
+        <w:lastRenderedPageBreak/>
         <w:drawing>
-          <wp:inline distT="0" distB="0" distL="0" distR="0" wp14:anchorId="243E41C0" wp14:editId="03AF5F17">
-            <wp:extent cx="5677231" cy="2362480"/>
-            <wp:effectExtent l="0" t="0" r="0" b="0"/>
-            <wp:docPr id="2" name="Picture 2"/>
+          <wp:inline distT="0" distB="0" distL="0" distR="0" wp14:anchorId="11CBFB71" wp14:editId="1E10C24F">
+            <wp:extent cx="5526157" cy="1763529"/>
+            <wp:effectExtent l="0" t="0" r="0" b="8255"/>
+            <wp:docPr id="3" name="Picture 3"/>
             <wp:cNvGraphicFramePr>
               <a:graphicFrameLocks xmlns:a="http://schemas.openxmlformats.org/drawingml/2006/main" noChangeAspect="1"/>
             </wp:cNvGraphicFramePr>
@@ -4676,7 +4822,7 @@
                   <pic:spPr>
                     <a:xfrm>
                       <a:off x="0" y="0"/>
-                      <a:ext cx="5687135" cy="2366601"/>
+                      <a:ext cx="5530591" cy="1764944"/>
                     </a:xfrm>
                     <a:prstGeom prst="rect">
                       <a:avLst/>
@@ -4689,46 +4835,717 @@
         </w:drawing>
       </w:r>
     </w:p>
-    <w:p/>
-    <w:p>
-      <w:r>
-        <w:t>This same model</w:t>
-      </w:r>
-      <w:r>
-        <w:t xml:space="preserve">, using </w:t>
-      </w:r>
-      <w:r>
-        <w:t>items, designators, labels and targets</w:t>
-      </w:r>
+    <w:p>
+      <w:r>
+        <w:t>E</w:t>
+      </w:r>
+      <w:r>
+        <w:t>lements</w:t>
+      </w:r>
+      <w:r>
+        <w:t xml:space="preserve"> of this type are</w:t>
+      </w:r>
+      <w:r>
+        <w:t>:</w:t>
+      </w:r>
+    </w:p>
+    <w:p>
+      <w:pPr>
+        <w:ind w:left="720"/>
+        <w:rPr>
+          <w:b/>
+        </w:rPr>
+      </w:pPr>
+      <w:r>
+        <w:t>toc</w:t>
+      </w:r>
+      <w:r>
+        <w:t xml:space="preserve">, </w:t>
+      </w:r>
+      <w:r>
+        <w:rPr>
+          <w:b/>
+        </w:rPr>
+        <w:t xml:space="preserve">index, </w:t>
+      </w:r>
+      <w:proofErr w:type="spellStart"/>
+      <w:r>
+        <w:rPr>
+          <w:b/>
+        </w:rPr>
+        <w:t>tableOfTitlesAndChapters</w:t>
+      </w:r>
+      <w:proofErr w:type="spellEnd"/>
+      <w:r>
+        <w:rPr>
+          <w:b/>
+        </w:rPr>
+        <w:t xml:space="preserve">, </w:t>
+      </w:r>
+      <w:proofErr w:type="spellStart"/>
+      <w:r>
+        <w:rPr>
+          <w:b/>
+        </w:rPr>
+        <w:t>listOfAgencies</w:t>
+      </w:r>
+      <w:proofErr w:type="spellEnd"/>
+      <w:r>
+        <w:rPr>
+          <w:b/>
+        </w:rPr>
+        <w:t xml:space="preserve">, </w:t>
+      </w:r>
+      <w:proofErr w:type="spellStart"/>
+      <w:r>
+        <w:rPr>
+          <w:b/>
+        </w:rPr>
+        <w:t>listOfSectionsAffected</w:t>
+      </w:r>
+      <w:proofErr w:type="spellEnd"/>
+      <w:r>
+        <w:rPr>
+          <w:b/>
+        </w:rPr>
+        <w:t xml:space="preserve">, </w:t>
+      </w:r>
+      <w:proofErr w:type="spellStart"/>
+      <w:r>
+        <w:rPr>
+          <w:b/>
+        </w:rPr>
+        <w:t>listOfBillsEnacted</w:t>
+      </w:r>
+      <w:proofErr w:type="spellEnd"/>
+      <w:r>
+        <w:rPr>
+          <w:b/>
+        </w:rPr>
+        <w:t xml:space="preserve">, </w:t>
+      </w:r>
+      <w:proofErr w:type="spellStart"/>
+      <w:r>
+        <w:rPr>
+          <w:b/>
+        </w:rPr>
+        <w:t>listOfPublicLaws</w:t>
+      </w:r>
+      <w:proofErr w:type="spellEnd"/>
+      <w:r>
+        <w:rPr>
+          <w:b/>
+        </w:rPr>
+        <w:t xml:space="preserve">, </w:t>
+      </w:r>
+      <w:proofErr w:type="spellStart"/>
+      <w:r>
+        <w:rPr>
+          <w:b/>
+        </w:rPr>
+        <w:t>listOfPrivateLaws</w:t>
+      </w:r>
+      <w:proofErr w:type="spellEnd"/>
+      <w:r>
+        <w:rPr>
+          <w:b/>
+        </w:rPr>
+        <w:t xml:space="preserve">, </w:t>
+      </w:r>
+      <w:proofErr w:type="spellStart"/>
+      <w:r>
+        <w:rPr>
+          <w:b/>
+        </w:rPr>
+        <w:t>listOfConcurrentResolutions</w:t>
+      </w:r>
+      <w:proofErr w:type="spellEnd"/>
+      <w:r>
+        <w:rPr>
+          <w:b/>
+        </w:rPr>
+        <w:t xml:space="preserve">, </w:t>
+      </w:r>
+      <w:proofErr w:type="spellStart"/>
+      <w:r>
+        <w:rPr>
+          <w:b/>
+        </w:rPr>
+        <w:t>listOfProclamations</w:t>
+      </w:r>
+      <w:proofErr w:type="spellEnd"/>
+      <w:r>
+        <w:rPr>
+          <w:b/>
+        </w:rPr>
+        <w:t xml:space="preserve">, </w:t>
+      </w:r>
+      <w:proofErr w:type="spellStart"/>
+      <w:r>
+        <w:rPr>
+          <w:b/>
+        </w:rPr>
+        <w:t>popularNameIndex</w:t>
+      </w:r>
+      <w:proofErr w:type="spellEnd"/>
+      <w:r>
+        <w:rPr>
+          <w:b/>
+        </w:rPr>
+        <w:t xml:space="preserve">, </w:t>
+      </w:r>
+      <w:proofErr w:type="spellStart"/>
+      <w:r>
+        <w:rPr>
+          <w:b/>
+        </w:rPr>
+        <w:t>subjectIndex</w:t>
+      </w:r>
+      <w:proofErr w:type="spellEnd"/>
+    </w:p>
+    <w:p>
+      <w:pPr>
+        <w:ind w:left="720"/>
+      </w:pPr>
+    </w:p>
+    <w:p>
+      <w:pPr>
+        <w:pStyle w:val="Heading3"/>
+      </w:pPr>
+      <w:bookmarkStart w:id="42" w:name="_Toc516835521"/>
+      <w:r>
+        <w:t>N</w:t>
+      </w:r>
+      <w:r>
+        <w:t>otes</w:t>
+      </w:r>
+      <w:bookmarkEnd w:id="42"/>
+    </w:p>
+    <w:p>
+      <w:r>
+        <w:t xml:space="preserve">In </w:t>
+      </w:r>
+      <w:r>
+        <w:t xml:space="preserve">version </w:t>
+      </w:r>
+      <w:r>
+        <w:t xml:space="preserve">1.0 </w:t>
+      </w:r>
+      <w:r>
+        <w:t>of the schema,</w:t>
+      </w:r>
+      <w:r>
+        <w:t xml:space="preserve"> all notes </w:t>
+      </w:r>
+      <w:r>
+        <w:t>had</w:t>
+      </w:r>
+      <w:r>
+        <w:t xml:space="preserve"> the same model</w:t>
+      </w:r>
+      <w:r>
+        <w:t>, including footnotes and U.S. Code notes</w:t>
+      </w:r>
+      <w:r>
+        <w:t xml:space="preserve">.  The </w:t>
+      </w:r>
+      <w:r>
+        <w:t>wider variety of notes in other document types drove a new model that has two types of notes:</w:t>
+      </w:r>
+    </w:p>
+    <w:p>
+      <w:pPr>
+        <w:pStyle w:val="Heading4"/>
+      </w:pPr>
+      <w:proofErr w:type="spellStart"/>
+      <w:r>
+        <w:t>NoteType</w:t>
+      </w:r>
+      <w:proofErr w:type="spellEnd"/>
+      <w:r>
+        <w:t xml:space="preserve"> Elements</w:t>
+      </w:r>
+    </w:p>
+    <w:p>
+      <w:r>
+        <w:t xml:space="preserve">A regular </w:t>
+      </w:r>
+      <w:proofErr w:type="spellStart"/>
+      <w:r>
+        <w:t>NoteType</w:t>
+      </w:r>
+      <w:proofErr w:type="spellEnd"/>
+      <w:r>
+        <w:t xml:space="preserve"> element is rendered directly in the main content flow. A U.S. Code note is an example of a </w:t>
+      </w:r>
+      <w:proofErr w:type="spellStart"/>
+      <w:r>
+        <w:t>NoteType</w:t>
+      </w:r>
+      <w:proofErr w:type="spellEnd"/>
+      <w:r>
+        <w:t xml:space="preserve"> element. Elements of this type are:</w:t>
+      </w:r>
+    </w:p>
+    <w:p>
+      <w:pPr>
+        <w:ind w:left="720"/>
+        <w:rPr>
+          <w:b/>
+        </w:rPr>
+      </w:pPr>
+      <w:r>
+        <w:t xml:space="preserve">note, </w:t>
+      </w:r>
+      <w:proofErr w:type="spellStart"/>
+      <w:r>
+        <w:t>sourceCredit</w:t>
+      </w:r>
+      <w:proofErr w:type="spellEnd"/>
+      <w:r>
+        <w:t xml:space="preserve">, </w:t>
+      </w:r>
+      <w:proofErr w:type="spellStart"/>
+      <w:r>
+        <w:t>statutoryNote</w:t>
+      </w:r>
+      <w:proofErr w:type="spellEnd"/>
+      <w:r>
+        <w:t xml:space="preserve">, </w:t>
+      </w:r>
+      <w:proofErr w:type="spellStart"/>
+      <w:r>
+        <w:t>editorialNote</w:t>
+      </w:r>
+      <w:proofErr w:type="spellEnd"/>
+      <w:r>
+        <w:t xml:space="preserve">, </w:t>
+      </w:r>
+      <w:proofErr w:type="spellStart"/>
+      <w:r>
+        <w:t>changeNote</w:t>
+      </w:r>
+      <w:proofErr w:type="spellEnd"/>
       <w:r>
         <w:t>,</w:t>
       </w:r>
       <w:r>
-        <w:t xml:space="preserve"> is also used for indexes that are found in legislative publications, such as </w:t>
-      </w:r>
-      <w:r>
-        <w:t>the</w:t>
-      </w:r>
-      <w:r>
-        <w:t xml:space="preserve"> Popular Name Index. Below </w:t>
-      </w:r>
-      <w:r>
-        <w:t xml:space="preserve">is </w:t>
-      </w:r>
-      <w:r>
-        <w:t xml:space="preserve">an illustration of </w:t>
-      </w:r>
-      <w:r>
-        <w:t xml:space="preserve">how </w:t>
-      </w:r>
-      <w:r>
-        <w:t xml:space="preserve">the model </w:t>
-      </w:r>
-      <w:r>
-        <w:t xml:space="preserve">can be </w:t>
-      </w:r>
-      <w:r>
-        <w:t>used for an index.</w:t>
+        <w:rPr>
+          <w:b/>
+        </w:rPr>
+        <w:t xml:space="preserve"> </w:t>
+      </w:r>
+      <w:r>
+        <w:rPr>
+          <w:b/>
+        </w:rPr>
+        <w:t xml:space="preserve">authority, source, </w:t>
+      </w:r>
+      <w:proofErr w:type="spellStart"/>
+      <w:r>
+        <w:rPr>
+          <w:b/>
+        </w:rPr>
+        <w:t>effectiveDateNote</w:t>
+      </w:r>
+      <w:proofErr w:type="spellEnd"/>
+      <w:r>
+        <w:rPr>
+          <w:b/>
+        </w:rPr>
+        <w:t xml:space="preserve">, </w:t>
+      </w:r>
+      <w:proofErr w:type="spellStart"/>
+      <w:r>
+        <w:rPr>
+          <w:b/>
+        </w:rPr>
+        <w:t>frDocID</w:t>
+      </w:r>
+      <w:proofErr w:type="spellEnd"/>
+      <w:r>
+        <w:rPr>
+          <w:b/>
+        </w:rPr>
+        <w:t xml:space="preserve">, </w:t>
+      </w:r>
+      <w:proofErr w:type="spellStart"/>
+      <w:r>
+        <w:rPr>
+          <w:b/>
+        </w:rPr>
+        <w:t>billingCode</w:t>
+      </w:r>
+      <w:proofErr w:type="spellEnd"/>
+      <w:r>
+        <w:rPr>
+          <w:b/>
+        </w:rPr>
+        <w:t xml:space="preserve">, </w:t>
+      </w:r>
+      <w:proofErr w:type="spellStart"/>
+      <w:r>
+        <w:rPr>
+          <w:b/>
+        </w:rPr>
+        <w:t>editionNote</w:t>
+      </w:r>
+      <w:proofErr w:type="spellEnd"/>
+      <w:r>
+        <w:rPr>
+          <w:b/>
+        </w:rPr>
+        <w:t xml:space="preserve">, </w:t>
+      </w:r>
+      <w:proofErr w:type="spellStart"/>
+      <w:r>
+        <w:rPr>
+          <w:b/>
+        </w:rPr>
+        <w:t>organizationNote</w:t>
+      </w:r>
+      <w:proofErr w:type="spellEnd"/>
+      <w:r>
+        <w:rPr>
+          <w:b/>
+        </w:rPr>
+        <w:t xml:space="preserve">, </w:t>
+      </w:r>
+      <w:proofErr w:type="spellStart"/>
+      <w:r>
+        <w:rPr>
+          <w:b/>
+        </w:rPr>
+        <w:t>citationNote</w:t>
+      </w:r>
+      <w:proofErr w:type="spellEnd"/>
+      <w:r>
+        <w:rPr>
+          <w:b/>
+        </w:rPr>
+        <w:t xml:space="preserve">, </w:t>
+      </w:r>
+      <w:proofErr w:type="spellStart"/>
+      <w:r>
+        <w:rPr>
+          <w:b/>
+        </w:rPr>
+        <w:t>explanationNote</w:t>
+      </w:r>
+      <w:proofErr w:type="spellEnd"/>
+      <w:r>
+        <w:rPr>
+          <w:b/>
+        </w:rPr>
+        <w:t xml:space="preserve">, </w:t>
+      </w:r>
+      <w:proofErr w:type="spellStart"/>
+      <w:r>
+        <w:rPr>
+          <w:b/>
+        </w:rPr>
+        <w:t>findingAidsNote</w:t>
+      </w:r>
+      <w:proofErr w:type="spellEnd"/>
+    </w:p>
+    <w:p>
+      <w:pPr>
+        <w:pStyle w:val="Heading4"/>
+      </w:pPr>
+      <w:proofErr w:type="spellStart"/>
+      <w:r>
+        <w:t>PositionNotetype</w:t>
+      </w:r>
+      <w:proofErr w:type="spellEnd"/>
+      <w:r>
+        <w:t xml:space="preserve"> elements</w:t>
+      </w:r>
+    </w:p>
+    <w:p>
+      <w:r>
+        <w:t xml:space="preserve">The content of a </w:t>
+      </w:r>
+      <w:proofErr w:type="spellStart"/>
+      <w:r>
+        <w:t>PositionedNoteType</w:t>
+      </w:r>
+      <w:proofErr w:type="spellEnd"/>
+      <w:r>
+        <w:t xml:space="preserve"> element is rendered at a different position from where it logically refers.  A footnote is an example of a positioned note. The positioned note has attributes for where it should be rendered. Elements of this type are:</w:t>
+      </w:r>
+    </w:p>
+    <w:p>
+      <w:pPr>
+        <w:ind w:left="720"/>
+      </w:pPr>
+      <w:r>
+        <w:t xml:space="preserve">footnote, </w:t>
+      </w:r>
+      <w:r>
+        <w:rPr>
+          <w:b/>
+        </w:rPr>
+        <w:t xml:space="preserve">sidenote, </w:t>
+      </w:r>
+      <w:proofErr w:type="spellStart"/>
+      <w:r>
+        <w:rPr>
+          <w:b/>
+        </w:rPr>
+        <w:t>leftRunningHead</w:t>
+      </w:r>
+      <w:proofErr w:type="spellEnd"/>
+      <w:r>
+        <w:rPr>
+          <w:b/>
+        </w:rPr>
+        <w:t xml:space="preserve">, </w:t>
+      </w:r>
+      <w:proofErr w:type="spellStart"/>
+      <w:r>
+        <w:rPr>
+          <w:b/>
+        </w:rPr>
+        <w:t>rightRunningHead</w:t>
+      </w:r>
+      <w:proofErr w:type="spellEnd"/>
+      <w:r>
+        <w:rPr>
+          <w:b/>
+        </w:rPr>
+        <w:t>, ear</w:t>
+      </w:r>
+      <w:r>
+        <w:rPr>
+          <w:rStyle w:val="FootnoteReference"/>
+          <w:b/>
+        </w:rPr>
+        <w:footnoteReference w:id="3"/>
+      </w:r>
+      <w:r>
+        <w:rPr>
+          <w:b/>
+        </w:rPr>
+        <w:t xml:space="preserve">, </w:t>
+      </w:r>
+      <w:proofErr w:type="spellStart"/>
+      <w:r>
+        <w:rPr>
+          <w:b/>
+        </w:rPr>
+        <w:t>endMarker</w:t>
+      </w:r>
+      <w:proofErr w:type="spellEnd"/>
+      <w:r>
+        <w:rPr>
+          <w:b/>
+        </w:rPr>
+        <w:t>, page, line</w:t>
+      </w:r>
+    </w:p>
+    <w:p>
+      <w:pPr>
+        <w:pStyle w:val="Heading2"/>
+        <w:ind w:left="540" w:hanging="540"/>
+      </w:pPr>
+      <w:bookmarkStart w:id="43" w:name="_Toc516835522"/>
+      <w:r>
+        <w:t>New Models</w:t>
+      </w:r>
+      <w:bookmarkEnd w:id="43"/>
+    </w:p>
+    <w:p>
+      <w:pPr>
+        <w:pStyle w:val="Heading3"/>
+      </w:pPr>
+      <w:bookmarkStart w:id="44" w:name="_Toc516835523"/>
+      <w:r>
+        <w:t>Collections</w:t>
+      </w:r>
+      <w:bookmarkEnd w:id="44"/>
+    </w:p>
+    <w:p>
+      <w:pPr>
+        <w:shd w:val="clear" w:color="auto" w:fill="FFFFFF"/>
+        <w:autoSpaceDE w:val="0"/>
+        <w:autoSpaceDN w:val="0"/>
+        <w:adjustRightInd w:val="0"/>
+        <w:spacing w:line="240" w:lineRule="auto"/>
+      </w:pPr>
+      <w:r>
+        <w:t xml:space="preserve">Some documents such as the Federal Register are </w:t>
+      </w:r>
+      <w:r>
+        <w:t xml:space="preserve">a </w:t>
+      </w:r>
+      <w:r>
+        <w:t>collection of other sub-documents.  In fact, a daily issue of the Federal Register is a collection of collections. In order to support this type of document, USLM 2.0 introduces a new “</w:t>
+      </w:r>
+      <w:proofErr w:type="spellStart"/>
+      <w:r>
+        <w:t>CollectionType</w:t>
+      </w:r>
+      <w:proofErr w:type="spellEnd"/>
+      <w:r>
+        <w:t>”</w:t>
+      </w:r>
+      <w:r>
+        <w:t xml:space="preserve"> which is</w:t>
+      </w:r>
+      <w:r>
+        <w:t xml:space="preserve"> described as:</w:t>
+      </w:r>
+    </w:p>
+    <w:p>
+      <w:pPr>
+        <w:shd w:val="clear" w:color="auto" w:fill="FFFFFF"/>
+        <w:autoSpaceDE w:val="0"/>
+        <w:autoSpaceDN w:val="0"/>
+        <w:adjustRightInd w:val="0"/>
+        <w:spacing w:line="240" w:lineRule="auto"/>
+        <w:ind w:left="720"/>
+        <w:rPr>
+          <w:rFonts w:ascii="Times New Roman" w:hAnsi="Times New Roman" w:cs="Times New Roman"/>
+          <w:sz w:val="24"/>
+          <w:szCs w:val="24"/>
+          <w:highlight w:val="white"/>
+        </w:rPr>
+      </w:pPr>
+      <w:r>
+        <w:rPr>
+          <w:rFonts w:asciiTheme="majorHAnsi" w:eastAsiaTheme="majorEastAsia" w:hAnsiTheme="majorHAnsi" w:cstheme="majorBidi"/>
+          <w:b/>
+          <w:bCs/>
+          <w:i/>
+          <w:iCs/>
+          <w:color w:val="000000" w:themeColor="text1"/>
+        </w:rPr>
+        <w:lastRenderedPageBreak/>
+        <w:t>The collection core type is the basic element in a document that is a collection of items, potentially from external sources. Collections may contain individual items and/or other collections.</w:t>
+      </w:r>
+    </w:p>
+    <w:p>
+      <w:r>
+        <w:t>A &lt;collection&gt; will contain a set of &lt;component&gt; elements. The &lt;component&gt; element acts as a wrapper for the individual document or fragment of the collection. The &lt;component&gt; may directly contain the content of the component, or it may point to the content by its @origin attribute.</w:t>
+      </w:r>
+    </w:p>
+    <w:p>
+      <w:r>
+        <w:t xml:space="preserve">The following elements are instances of </w:t>
+      </w:r>
+      <w:proofErr w:type="spellStart"/>
+      <w:r>
+        <w:t>CollectionType</w:t>
+      </w:r>
+      <w:proofErr w:type="spellEnd"/>
+      <w:r>
+        <w:t>:</w:t>
+      </w:r>
+    </w:p>
+    <w:p>
+      <w:pPr>
+        <w:ind w:left="720"/>
+        <w:rPr>
+          <w:b/>
+        </w:rPr>
+      </w:pPr>
+      <w:r>
+        <w:rPr>
+          <w:b/>
+        </w:rPr>
+        <w:t xml:space="preserve">notices, rules, </w:t>
+      </w:r>
+      <w:proofErr w:type="spellStart"/>
+      <w:r>
+        <w:rPr>
+          <w:b/>
+        </w:rPr>
+        <w:t>proposedRules</w:t>
+      </w:r>
+      <w:proofErr w:type="spellEnd"/>
+      <w:r>
+        <w:rPr>
+          <w:b/>
+        </w:rPr>
+        <w:t xml:space="preserve">, </w:t>
+      </w:r>
+      <w:proofErr w:type="spellStart"/>
+      <w:r>
+        <w:rPr>
+          <w:b/>
+        </w:rPr>
+        <w:t>presidentialDocs</w:t>
+      </w:r>
+      <w:proofErr w:type="spellEnd"/>
+      <w:r>
+        <w:rPr>
+          <w:b/>
+        </w:rPr>
+        <w:t xml:space="preserve">, </w:t>
+      </w:r>
+      <w:proofErr w:type="spellStart"/>
+      <w:r>
+        <w:rPr>
+          <w:b/>
+        </w:rPr>
+        <w:t>agencyGroup</w:t>
+      </w:r>
+      <w:proofErr w:type="spellEnd"/>
+      <w:r>
+        <w:rPr>
+          <w:b/>
+        </w:rPr>
+        <w:t xml:space="preserve">, </w:t>
+      </w:r>
+      <w:proofErr w:type="spellStart"/>
+      <w:r>
+        <w:rPr>
+          <w:b/>
+        </w:rPr>
+        <w:t>publicLaws</w:t>
+      </w:r>
+      <w:proofErr w:type="spellEnd"/>
+      <w:r>
+        <w:rPr>
+          <w:b/>
+        </w:rPr>
+        <w:t xml:space="preserve">, </w:t>
+      </w:r>
+      <w:proofErr w:type="spellStart"/>
+      <w:r>
+        <w:rPr>
+          <w:b/>
+        </w:rPr>
+        <w:t>privateLaws</w:t>
+      </w:r>
+      <w:proofErr w:type="spellEnd"/>
+      <w:r>
+        <w:rPr>
+          <w:b/>
+        </w:rPr>
+        <w:t xml:space="preserve">, </w:t>
+      </w:r>
+      <w:proofErr w:type="spellStart"/>
+      <w:r>
+        <w:rPr>
+          <w:b/>
+        </w:rPr>
+        <w:t>concurrentResolutions</w:t>
+      </w:r>
+      <w:proofErr w:type="spellEnd"/>
+    </w:p>
+    <w:p>
+      <w:r>
+        <w:t xml:space="preserve">Below is an example of </w:t>
+      </w:r>
+      <w:r>
+        <w:t xml:space="preserve">a collection used to group multiple </w:t>
+      </w:r>
+      <w:r>
+        <w:t xml:space="preserve">document-specific units </w:t>
+      </w:r>
+      <w:r>
+        <w:t>in an issue of the Federal Register:</w:t>
       </w:r>
     </w:p>
     <w:p>
@@ -4737,12 +5554,11 @@
           <w:noProof/>
           <w:lang w:val="en-CA" w:eastAsia="en-CA"/>
         </w:rPr>
-        <w:lastRenderedPageBreak/>
         <w:drawing>
-          <wp:inline distT="0" distB="0" distL="0" distR="0" wp14:anchorId="11CBFB71" wp14:editId="1E10C24F">
-            <wp:extent cx="5526157" cy="1763529"/>
-            <wp:effectExtent l="0" t="0" r="0" b="8255"/>
-            <wp:docPr id="3" name="Picture 3"/>
+          <wp:inline distT="0" distB="0" distL="0" distR="0" wp14:anchorId="0377AE89" wp14:editId="4C046844">
+            <wp:extent cx="5943600" cy="3789680"/>
+            <wp:effectExtent l="0" t="0" r="0" b="1270"/>
+            <wp:docPr id="4" name="Picture 4"/>
             <wp:cNvGraphicFramePr>
               <a:graphicFrameLocks xmlns:a="http://schemas.openxmlformats.org/drawingml/2006/main" noChangeAspect="1"/>
             </wp:cNvGraphicFramePr>
@@ -4762,770 +5578,6 @@
                   <pic:spPr>
                     <a:xfrm>
                       <a:off x="0" y="0"/>
-                      <a:ext cx="5530591" cy="1764944"/>
-                    </a:xfrm>
-                    <a:prstGeom prst="rect">
-                      <a:avLst/>
-                    </a:prstGeom>
-                  </pic:spPr>
-                </pic:pic>
-              </a:graphicData>
-            </a:graphic>
-          </wp:inline>
-        </w:drawing>
-      </w:r>
-    </w:p>
-    <w:p>
-      <w:r>
-        <w:t>E</w:t>
-      </w:r>
-      <w:r>
-        <w:t>lements</w:t>
-      </w:r>
-      <w:r>
-        <w:t xml:space="preserve"> of this type are</w:t>
-      </w:r>
-      <w:r>
-        <w:t>:</w:t>
-      </w:r>
-    </w:p>
-    <w:p>
-      <w:pPr>
-        <w:ind w:left="720"/>
-        <w:rPr>
-          <w:b/>
-        </w:rPr>
-      </w:pPr>
-      <w:r>
-        <w:t>toc</w:t>
-      </w:r>
-      <w:r>
-        <w:t xml:space="preserve">, </w:t>
-      </w:r>
-      <w:r>
-        <w:rPr>
-          <w:b/>
-        </w:rPr>
-        <w:t xml:space="preserve">index, </w:t>
-      </w:r>
-      <w:proofErr w:type="spellStart"/>
-      <w:r>
-        <w:rPr>
-          <w:b/>
-        </w:rPr>
-        <w:t>tableOfTitlesAndChapters</w:t>
-      </w:r>
-      <w:proofErr w:type="spellEnd"/>
-      <w:r>
-        <w:rPr>
-          <w:b/>
-        </w:rPr>
-        <w:t xml:space="preserve">, </w:t>
-      </w:r>
-      <w:proofErr w:type="spellStart"/>
-      <w:r>
-        <w:rPr>
-          <w:b/>
-        </w:rPr>
-        <w:t>listOfAgencies</w:t>
-      </w:r>
-      <w:proofErr w:type="spellEnd"/>
-      <w:r>
-        <w:rPr>
-          <w:b/>
-        </w:rPr>
-        <w:t xml:space="preserve">, </w:t>
-      </w:r>
-      <w:proofErr w:type="spellStart"/>
-      <w:r>
-        <w:rPr>
-          <w:b/>
-        </w:rPr>
-        <w:t>listOfSectionsAffected</w:t>
-      </w:r>
-      <w:proofErr w:type="spellEnd"/>
-      <w:r>
-        <w:rPr>
-          <w:b/>
-        </w:rPr>
-        <w:t xml:space="preserve">, </w:t>
-      </w:r>
-      <w:proofErr w:type="spellStart"/>
-      <w:r>
-        <w:rPr>
-          <w:b/>
-        </w:rPr>
-        <w:t>listOfBillsEnacted</w:t>
-      </w:r>
-      <w:proofErr w:type="spellEnd"/>
-      <w:r>
-        <w:rPr>
-          <w:b/>
-        </w:rPr>
-        <w:t xml:space="preserve">, </w:t>
-      </w:r>
-      <w:proofErr w:type="spellStart"/>
-      <w:r>
-        <w:rPr>
-          <w:b/>
-        </w:rPr>
-        <w:t>listOfPublicLaws</w:t>
-      </w:r>
-      <w:proofErr w:type="spellEnd"/>
-      <w:r>
-        <w:rPr>
-          <w:b/>
-        </w:rPr>
-        <w:t xml:space="preserve">, </w:t>
-      </w:r>
-      <w:proofErr w:type="spellStart"/>
-      <w:r>
-        <w:rPr>
-          <w:b/>
-        </w:rPr>
-        <w:t>listOfPrivateLaws</w:t>
-      </w:r>
-      <w:proofErr w:type="spellEnd"/>
-      <w:r>
-        <w:rPr>
-          <w:b/>
-        </w:rPr>
-        <w:t xml:space="preserve">, </w:t>
-      </w:r>
-      <w:proofErr w:type="spellStart"/>
-      <w:r>
-        <w:rPr>
-          <w:b/>
-        </w:rPr>
-        <w:t>listOfConcurrentResolutions</w:t>
-      </w:r>
-      <w:proofErr w:type="spellEnd"/>
-      <w:r>
-        <w:rPr>
-          <w:b/>
-        </w:rPr>
-        <w:t xml:space="preserve">, </w:t>
-      </w:r>
-      <w:proofErr w:type="spellStart"/>
-      <w:r>
-        <w:rPr>
-          <w:b/>
-        </w:rPr>
-        <w:t>listOfProclamations</w:t>
-      </w:r>
-      <w:proofErr w:type="spellEnd"/>
-      <w:r>
-        <w:rPr>
-          <w:b/>
-        </w:rPr>
-        <w:t xml:space="preserve">, </w:t>
-      </w:r>
-      <w:proofErr w:type="spellStart"/>
-      <w:r>
-        <w:rPr>
-          <w:b/>
-        </w:rPr>
-        <w:t>popularNameIndex</w:t>
-      </w:r>
-      <w:proofErr w:type="spellEnd"/>
-      <w:r>
-        <w:rPr>
-          <w:b/>
-        </w:rPr>
-        <w:t xml:space="preserve">, </w:t>
-      </w:r>
-      <w:proofErr w:type="spellStart"/>
-      <w:r>
-        <w:rPr>
-          <w:b/>
-        </w:rPr>
-        <w:t>subjectIndex</w:t>
-      </w:r>
-      <w:proofErr w:type="spellEnd"/>
-    </w:p>
-    <w:p>
-      <w:pPr>
-        <w:ind w:left="720"/>
-      </w:pPr>
-    </w:p>
-    <w:p>
-      <w:pPr>
-        <w:pStyle w:val="Heading3"/>
-      </w:pPr>
-      <w:bookmarkStart w:id="38" w:name="_Toc516835521"/>
-      <w:r>
-        <w:t>N</w:t>
-      </w:r>
-      <w:r>
-        <w:t>otes</w:t>
-      </w:r>
-      <w:bookmarkEnd w:id="38"/>
-    </w:p>
-    <w:p>
-      <w:r>
-        <w:t xml:space="preserve">In </w:t>
-      </w:r>
-      <w:r>
-        <w:t xml:space="preserve">version </w:t>
-      </w:r>
-      <w:r>
-        <w:t xml:space="preserve">1.0 </w:t>
-      </w:r>
-      <w:r>
-        <w:t>of the schema,</w:t>
-      </w:r>
-      <w:r>
-        <w:t xml:space="preserve"> all notes </w:t>
-      </w:r>
-      <w:r>
-        <w:t>had</w:t>
-      </w:r>
-      <w:r>
-        <w:t xml:space="preserve"> the same model</w:t>
-      </w:r>
-      <w:r>
-        <w:t>, including footnotes and U.S. Code notes</w:t>
-      </w:r>
-      <w:r>
-        <w:t xml:space="preserve">.  The </w:t>
-      </w:r>
-      <w:r>
-        <w:t>wider variety of notes in other document types drove a new model that has two types of notes:</w:t>
-      </w:r>
-    </w:p>
-    <w:p>
-      <w:pPr>
-        <w:pStyle w:val="Heading4"/>
-      </w:pPr>
-      <w:proofErr w:type="spellStart"/>
-      <w:r>
-        <w:t>NoteType</w:t>
-      </w:r>
-      <w:proofErr w:type="spellEnd"/>
-      <w:r>
-        <w:t xml:space="preserve"> Elements</w:t>
-      </w:r>
-    </w:p>
-    <w:p>
-      <w:r>
-        <w:t xml:space="preserve">A regular </w:t>
-      </w:r>
-      <w:proofErr w:type="spellStart"/>
-      <w:r>
-        <w:t>NoteType</w:t>
-      </w:r>
-      <w:proofErr w:type="spellEnd"/>
-      <w:r>
-        <w:t xml:space="preserve"> element is rendered directly in the main content flow. A U.S. Code note is an example of a </w:t>
-      </w:r>
-      <w:proofErr w:type="spellStart"/>
-      <w:r>
-        <w:t>NoteType</w:t>
-      </w:r>
-      <w:proofErr w:type="spellEnd"/>
-      <w:r>
-        <w:t xml:space="preserve"> element. Elements of this type are:</w:t>
-      </w:r>
-    </w:p>
-    <w:p>
-      <w:pPr>
-        <w:ind w:left="720"/>
-        <w:rPr>
-          <w:b/>
-        </w:rPr>
-      </w:pPr>
-      <w:r>
-        <w:t xml:space="preserve">note, </w:t>
-      </w:r>
-      <w:proofErr w:type="spellStart"/>
-      <w:r>
-        <w:t>sourceCredit</w:t>
-      </w:r>
-      <w:proofErr w:type="spellEnd"/>
-      <w:r>
-        <w:t xml:space="preserve">, </w:t>
-      </w:r>
-      <w:proofErr w:type="spellStart"/>
-      <w:r>
-        <w:t>statutoryNote</w:t>
-      </w:r>
-      <w:proofErr w:type="spellEnd"/>
-      <w:r>
-        <w:t xml:space="preserve">, </w:t>
-      </w:r>
-      <w:proofErr w:type="spellStart"/>
-      <w:r>
-        <w:t>editorialNote</w:t>
-      </w:r>
-      <w:proofErr w:type="spellEnd"/>
-      <w:r>
-        <w:t xml:space="preserve">, </w:t>
-      </w:r>
-      <w:proofErr w:type="spellStart"/>
-      <w:r>
-        <w:t>changeNote</w:t>
-      </w:r>
-      <w:proofErr w:type="spellEnd"/>
-      <w:r>
-        <w:t>,</w:t>
-      </w:r>
-      <w:r>
-        <w:rPr>
-          <w:b/>
-        </w:rPr>
-        <w:t xml:space="preserve"> </w:t>
-      </w:r>
-      <w:r>
-        <w:rPr>
-          <w:b/>
-        </w:rPr>
-        <w:t xml:space="preserve">authority, source, </w:t>
-      </w:r>
-      <w:proofErr w:type="spellStart"/>
-      <w:r>
-        <w:rPr>
-          <w:b/>
-        </w:rPr>
-        <w:t>effectiveDateNote</w:t>
-      </w:r>
-      <w:proofErr w:type="spellEnd"/>
-      <w:r>
-        <w:rPr>
-          <w:b/>
-        </w:rPr>
-        <w:t xml:space="preserve">, </w:t>
-      </w:r>
-      <w:proofErr w:type="spellStart"/>
-      <w:r>
-        <w:rPr>
-          <w:b/>
-        </w:rPr>
-        <w:t>frDocID</w:t>
-      </w:r>
-      <w:proofErr w:type="spellEnd"/>
-      <w:r>
-        <w:rPr>
-          <w:b/>
-        </w:rPr>
-        <w:t xml:space="preserve">, </w:t>
-      </w:r>
-      <w:proofErr w:type="spellStart"/>
-      <w:r>
-        <w:rPr>
-          <w:b/>
-        </w:rPr>
-        <w:t>billingCode</w:t>
-      </w:r>
-      <w:proofErr w:type="spellEnd"/>
-      <w:r>
-        <w:rPr>
-          <w:b/>
-        </w:rPr>
-        <w:t xml:space="preserve">, </w:t>
-      </w:r>
-      <w:proofErr w:type="spellStart"/>
-      <w:r>
-        <w:rPr>
-          <w:b/>
-        </w:rPr>
-        <w:t>editionNote</w:t>
-      </w:r>
-      <w:proofErr w:type="spellEnd"/>
-      <w:r>
-        <w:rPr>
-          <w:b/>
-        </w:rPr>
-        <w:t xml:space="preserve">, </w:t>
-      </w:r>
-      <w:proofErr w:type="spellStart"/>
-      <w:r>
-        <w:rPr>
-          <w:b/>
-        </w:rPr>
-        <w:t>organizationNote</w:t>
-      </w:r>
-      <w:proofErr w:type="spellEnd"/>
-      <w:r>
-        <w:rPr>
-          <w:b/>
-        </w:rPr>
-        <w:t xml:space="preserve">, </w:t>
-      </w:r>
-      <w:proofErr w:type="spellStart"/>
-      <w:r>
-        <w:rPr>
-          <w:b/>
-        </w:rPr>
-        <w:t>citationNote</w:t>
-      </w:r>
-      <w:proofErr w:type="spellEnd"/>
-      <w:r>
-        <w:rPr>
-          <w:b/>
-        </w:rPr>
-        <w:t xml:space="preserve">, </w:t>
-      </w:r>
-      <w:proofErr w:type="spellStart"/>
-      <w:r>
-        <w:rPr>
-          <w:b/>
-        </w:rPr>
-        <w:t>explanationNote</w:t>
-      </w:r>
-      <w:proofErr w:type="spellEnd"/>
-      <w:r>
-        <w:rPr>
-          <w:b/>
-        </w:rPr>
-        <w:t xml:space="preserve">, </w:t>
-      </w:r>
-      <w:proofErr w:type="spellStart"/>
-      <w:r>
-        <w:rPr>
-          <w:b/>
-        </w:rPr>
-        <w:t>findingAidsNote</w:t>
-      </w:r>
-      <w:proofErr w:type="spellEnd"/>
-    </w:p>
-    <w:p>
-      <w:pPr>
-        <w:pStyle w:val="Heading4"/>
-      </w:pPr>
-      <w:proofErr w:type="spellStart"/>
-      <w:r>
-        <w:t>PositionNotetype</w:t>
-      </w:r>
-      <w:proofErr w:type="spellEnd"/>
-      <w:r>
-        <w:t xml:space="preserve"> elements</w:t>
-      </w:r>
-    </w:p>
-    <w:p>
-      <w:r>
-        <w:t xml:space="preserve">The content of a </w:t>
-      </w:r>
-      <w:proofErr w:type="spellStart"/>
-      <w:r>
-        <w:t>PositionedNoteType</w:t>
-      </w:r>
-      <w:proofErr w:type="spellEnd"/>
-      <w:r>
-        <w:t xml:space="preserve"> element is rendered at a different position from where it logically refers.  A footnote is an example of a positioned note. The positioned note has attributes for where it should be rendered. Elements of this type are:</w:t>
-      </w:r>
-    </w:p>
-    <w:p>
-      <w:pPr>
-        <w:ind w:left="720"/>
-      </w:pPr>
-      <w:r>
-        <w:t xml:space="preserve">footnote, </w:t>
-      </w:r>
-      <w:proofErr w:type="spellStart"/>
-      <w:r>
-        <w:rPr>
-          <w:b/>
-        </w:rPr>
-        <w:t>sidenote</w:t>
-      </w:r>
-      <w:proofErr w:type="spellEnd"/>
-      <w:r>
-        <w:rPr>
-          <w:b/>
-        </w:rPr>
-        <w:t xml:space="preserve">, </w:t>
-      </w:r>
-      <w:proofErr w:type="spellStart"/>
-      <w:r>
-        <w:rPr>
-          <w:b/>
-        </w:rPr>
-        <w:t>leftRunningHead</w:t>
-      </w:r>
-      <w:proofErr w:type="spellEnd"/>
-      <w:r>
-        <w:rPr>
-          <w:b/>
-        </w:rPr>
-        <w:t xml:space="preserve">, </w:t>
-      </w:r>
-      <w:proofErr w:type="spellStart"/>
-      <w:r>
-        <w:rPr>
-          <w:b/>
-        </w:rPr>
-        <w:t>rightRunningHead</w:t>
-      </w:r>
-      <w:proofErr w:type="spellEnd"/>
-      <w:r>
-        <w:rPr>
-          <w:b/>
-        </w:rPr>
-        <w:t>, ear</w:t>
-      </w:r>
-      <w:r>
-        <w:rPr>
-          <w:rStyle w:val="FootnoteReference"/>
-          <w:b/>
-        </w:rPr>
-        <w:footnoteReference w:id="3"/>
-      </w:r>
-      <w:r>
-        <w:rPr>
-          <w:b/>
-        </w:rPr>
-        <w:t xml:space="preserve">, </w:t>
-      </w:r>
-      <w:proofErr w:type="spellStart"/>
-      <w:r>
-        <w:rPr>
-          <w:b/>
-        </w:rPr>
-        <w:t>endMarker</w:t>
-      </w:r>
-      <w:proofErr w:type="spellEnd"/>
-      <w:r>
-        <w:rPr>
-          <w:b/>
-        </w:rPr>
-        <w:t>, page, line</w:t>
-      </w:r>
-    </w:p>
-    <w:p>
-      <w:pPr>
-        <w:pStyle w:val="Heading2"/>
-        <w:ind w:left="540" w:hanging="540"/>
-      </w:pPr>
-      <w:bookmarkStart w:id="39" w:name="_Toc516835522"/>
-      <w:r>
-        <w:t>New Models</w:t>
-      </w:r>
-      <w:bookmarkEnd w:id="39"/>
-    </w:p>
-    <w:p>
-      <w:pPr>
-        <w:pStyle w:val="Heading3"/>
-      </w:pPr>
-      <w:bookmarkStart w:id="40" w:name="_Toc516835523"/>
-      <w:r>
-        <w:t>Collections</w:t>
-      </w:r>
-      <w:bookmarkEnd w:id="40"/>
-    </w:p>
-    <w:p>
-      <w:pPr>
-        <w:shd w:val="clear" w:color="auto" w:fill="FFFFFF"/>
-        <w:autoSpaceDE w:val="0"/>
-        <w:autoSpaceDN w:val="0"/>
-        <w:adjustRightInd w:val="0"/>
-        <w:spacing w:line="240" w:lineRule="auto"/>
-      </w:pPr>
-      <w:r>
-        <w:t xml:space="preserve">Some documents such as the Federal Register are </w:t>
-      </w:r>
-      <w:r>
-        <w:t xml:space="preserve">a </w:t>
-      </w:r>
-      <w:r>
-        <w:t>collection of other sub-documents.  In fact, a daily issue of the Federal Register is a collection of collections. In order to support this type of document, USLM 2.0 introduces a new “</w:t>
-      </w:r>
-      <w:proofErr w:type="spellStart"/>
-      <w:r>
-        <w:t>CollectionType</w:t>
-      </w:r>
-      <w:proofErr w:type="spellEnd"/>
-      <w:r>
-        <w:t>”</w:t>
-      </w:r>
-      <w:r>
-        <w:t xml:space="preserve"> which is</w:t>
-      </w:r>
-      <w:r>
-        <w:t xml:space="preserve"> described as:</w:t>
-      </w:r>
-    </w:p>
-    <w:p>
-      <w:pPr>
-        <w:shd w:val="clear" w:color="auto" w:fill="FFFFFF"/>
-        <w:autoSpaceDE w:val="0"/>
-        <w:autoSpaceDN w:val="0"/>
-        <w:adjustRightInd w:val="0"/>
-        <w:spacing w:line="240" w:lineRule="auto"/>
-        <w:ind w:left="720"/>
-        <w:rPr>
-          <w:rFonts w:ascii="Times New Roman" w:hAnsi="Times New Roman" w:cs="Times New Roman"/>
-          <w:sz w:val="24"/>
-          <w:szCs w:val="24"/>
-          <w:highlight w:val="white"/>
-        </w:rPr>
-      </w:pPr>
-      <w:r>
-        <w:rPr>
-          <w:rFonts w:asciiTheme="majorHAnsi" w:eastAsiaTheme="majorEastAsia" w:hAnsiTheme="majorHAnsi" w:cstheme="majorBidi"/>
-          <w:b/>
-          <w:bCs/>
-          <w:i/>
-          <w:iCs/>
-          <w:color w:val="000000" w:themeColor="text1"/>
-        </w:rPr>
-        <w:lastRenderedPageBreak/>
-        <w:t>The collection core type is the basic element in a document that is a collection of items, potentially from external sources. Collections may contain individual items and/or other collections.</w:t>
-      </w:r>
-    </w:p>
-    <w:p>
-      <w:r>
-        <w:t>A &lt;collection&gt; will contain a set of &lt;component&gt; elements. The &lt;component&gt; element acts as a wrapper for the individual document or fragment of the collection. The &lt;component&gt; may directly contain the content of the component, or it may point to the content by its @origin attribute.</w:t>
-      </w:r>
-    </w:p>
-    <w:p>
-      <w:r>
-        <w:t xml:space="preserve">The following elements are instances of </w:t>
-      </w:r>
-      <w:proofErr w:type="spellStart"/>
-      <w:r>
-        <w:t>CollectionType</w:t>
-      </w:r>
-      <w:proofErr w:type="spellEnd"/>
-      <w:r>
-        <w:t>:</w:t>
-      </w:r>
-    </w:p>
-    <w:p>
-      <w:pPr>
-        <w:ind w:left="720"/>
-        <w:rPr>
-          <w:b/>
-        </w:rPr>
-      </w:pPr>
-      <w:r>
-        <w:rPr>
-          <w:b/>
-        </w:rPr>
-        <w:t xml:space="preserve">notices, rules, </w:t>
-      </w:r>
-      <w:proofErr w:type="spellStart"/>
-      <w:r>
-        <w:rPr>
-          <w:b/>
-        </w:rPr>
-        <w:t>proposedRules</w:t>
-      </w:r>
-      <w:proofErr w:type="spellEnd"/>
-      <w:r>
-        <w:rPr>
-          <w:b/>
-        </w:rPr>
-        <w:t xml:space="preserve">, </w:t>
-      </w:r>
-      <w:proofErr w:type="spellStart"/>
-      <w:r>
-        <w:rPr>
-          <w:b/>
-        </w:rPr>
-        <w:t>presidentialDocs</w:t>
-      </w:r>
-      <w:proofErr w:type="spellEnd"/>
-      <w:r>
-        <w:rPr>
-          <w:b/>
-        </w:rPr>
-        <w:t xml:space="preserve">, </w:t>
-      </w:r>
-      <w:proofErr w:type="spellStart"/>
-      <w:r>
-        <w:rPr>
-          <w:b/>
-        </w:rPr>
-        <w:t>agencyGroup</w:t>
-      </w:r>
-      <w:proofErr w:type="spellEnd"/>
-      <w:r>
-        <w:rPr>
-          <w:b/>
-        </w:rPr>
-        <w:t xml:space="preserve">, </w:t>
-      </w:r>
-      <w:proofErr w:type="spellStart"/>
-      <w:r>
-        <w:rPr>
-          <w:b/>
-        </w:rPr>
-        <w:t>publicLaws</w:t>
-      </w:r>
-      <w:proofErr w:type="spellEnd"/>
-      <w:r>
-        <w:rPr>
-          <w:b/>
-        </w:rPr>
-        <w:t xml:space="preserve">, </w:t>
-      </w:r>
-      <w:proofErr w:type="spellStart"/>
-      <w:r>
-        <w:rPr>
-          <w:b/>
-        </w:rPr>
-        <w:t>privateLaws</w:t>
-      </w:r>
-      <w:proofErr w:type="spellEnd"/>
-      <w:r>
-        <w:rPr>
-          <w:b/>
-        </w:rPr>
-        <w:t xml:space="preserve">, </w:t>
-      </w:r>
-      <w:proofErr w:type="spellStart"/>
-      <w:r>
-        <w:rPr>
-          <w:b/>
-        </w:rPr>
-        <w:t>concurrentResolutions</w:t>
-      </w:r>
-      <w:proofErr w:type="spellEnd"/>
-    </w:p>
-    <w:p>
-      <w:r>
-        <w:t xml:space="preserve">Below is an example of </w:t>
-      </w:r>
-      <w:r>
-        <w:t xml:space="preserve">a collection used to group multiple </w:t>
-      </w:r>
-      <w:r>
-        <w:t xml:space="preserve">document-specific units </w:t>
-      </w:r>
-      <w:r>
-        <w:t>in an issue of the Federal Register:</w:t>
-      </w:r>
-    </w:p>
-    <w:p>
-      <w:r>
-        <w:rPr>
-          <w:noProof/>
-          <w:lang w:val="en-CA" w:eastAsia="en-CA"/>
-        </w:rPr>
-        <w:drawing>
-          <wp:inline distT="0" distB="0" distL="0" distR="0" wp14:anchorId="0377AE89" wp14:editId="4C046844">
-            <wp:extent cx="5943600" cy="3789680"/>
-            <wp:effectExtent l="0" t="0" r="0" b="1270"/>
-            <wp:docPr id="4" name="Picture 4"/>
-            <wp:cNvGraphicFramePr>
-              <a:graphicFrameLocks xmlns:a="http://schemas.openxmlformats.org/drawingml/2006/main" noChangeAspect="1"/>
-            </wp:cNvGraphicFramePr>
-            <a:graphic xmlns:a="http://schemas.openxmlformats.org/drawingml/2006/main">
-              <a:graphicData uri="http://schemas.openxmlformats.org/drawingml/2006/picture">
-                <pic:pic xmlns:pic="http://schemas.openxmlformats.org/drawingml/2006/picture">
-                  <pic:nvPicPr>
-                    <pic:cNvPr id="1" name=""/>
-                    <pic:cNvPicPr/>
-                  </pic:nvPicPr>
-                  <pic:blipFill>
-                    <a:blip r:embed="rId17"/>
-                    <a:stretch>
-                      <a:fillRect/>
-                    </a:stretch>
-                  </pic:blipFill>
-                  <pic:spPr>
-                    <a:xfrm>
-                      <a:off x="0" y="0"/>
                       <a:ext cx="5943600" cy="3789680"/>
                     </a:xfrm>
                     <a:prstGeom prst="rect">
@@ -5556,12 +5608,12 @@
       <w:pPr>
         <w:pStyle w:val="Heading3"/>
       </w:pPr>
-      <w:bookmarkStart w:id="41" w:name="_Toc516835524"/>
+      <w:bookmarkStart w:id="45" w:name="_Toc516835524"/>
       <w:r>
         <w:lastRenderedPageBreak/>
         <w:t>Lists</w:t>
       </w:r>
-      <w:bookmarkEnd w:id="41"/>
+      <w:bookmarkEnd w:id="45"/>
     </w:p>
     <w:p>
       <w:r>
@@ -5612,12 +5664,12 @@
       <w:r>
         <w:t xml:space="preserve">are subtly different from XHTML. </w:t>
       </w:r>
-      <w:del w:id="42" w:author="Author">
+      <w:del w:id="46" w:author="Author">
         <w:r>
           <w:delText>Thus</w:delText>
         </w:r>
       </w:del>
-      <w:ins w:id="43" w:author="Author">
+      <w:ins w:id="47" w:author="Author">
         <w:r>
           <w:t>Thus,</w:t>
         </w:r>
@@ -5696,11 +5748,11 @@
       <w:pPr>
         <w:pStyle w:val="Heading3"/>
       </w:pPr>
-      <w:bookmarkStart w:id="44" w:name="_Toc516835525"/>
+      <w:bookmarkStart w:id="48" w:name="_Toc516835525"/>
       <w:r>
         <w:t>Preface</w:t>
       </w:r>
-      <w:bookmarkEnd w:id="44"/>
+      <w:bookmarkEnd w:id="48"/>
     </w:p>
     <w:p>
       <w:r>
@@ -5867,7 +5919,7 @@
       <w:pPr>
         <w:pStyle w:val="Heading3"/>
       </w:pPr>
-      <w:bookmarkStart w:id="45" w:name="_Toc516835526"/>
+      <w:bookmarkStart w:id="49" w:name="_Toc516835526"/>
       <w:r>
         <w:t>Back</w:t>
       </w:r>
@@ -5877,7 +5929,7 @@
       <w:r>
         <w:t>Matter</w:t>
       </w:r>
-      <w:bookmarkEnd w:id="45"/>
+      <w:bookmarkEnd w:id="49"/>
     </w:p>
     <w:p>
       <w:r>
@@ -5933,11 +5985,11 @@
       <w:pPr>
         <w:pStyle w:val="Heading3"/>
       </w:pPr>
-      <w:bookmarkStart w:id="46" w:name="_Toc516835527"/>
+      <w:bookmarkStart w:id="50" w:name="_Toc516835527"/>
       <w:r>
         <w:t>Rule Preamble</w:t>
       </w:r>
-      <w:bookmarkEnd w:id="46"/>
+      <w:bookmarkEnd w:id="50"/>
     </w:p>
     <w:p>
       <w:r>
@@ -5963,11 +6015,11 @@
       <w:pPr>
         <w:pStyle w:val="Heading3"/>
       </w:pPr>
-      <w:bookmarkStart w:id="47" w:name="_Toc516835528"/>
+      <w:bookmarkStart w:id="51" w:name="_Toc516835528"/>
       <w:r>
         <w:t>Appropriations</w:t>
       </w:r>
-      <w:bookmarkEnd w:id="47"/>
+      <w:bookmarkEnd w:id="51"/>
     </w:p>
     <w:p>
       <w:r>
@@ -6069,9 +6121,11 @@
           <w:highlight w:val="white"/>
         </w:rPr>
       </w:pPr>
+      <w:proofErr w:type="gramStart"/>
       <w:r>
         <w:t>@level</w:t>
       </w:r>
+      <w:proofErr w:type="gramEnd"/>
       <w:r>
         <w:tab/>
       </w:r>
@@ -6151,13 +6205,8 @@
         </w:rPr>
       </w:pPr>
       <w:r>
-        <w:t>@</w:t>
-      </w:r>
-      <w:proofErr w:type="spellStart"/>
-      <w:r>
-        <w:t>forType</w:t>
-      </w:r>
-      <w:proofErr w:type="spellEnd"/>
+        <w:t>@forType</w:t>
+      </w:r>
       <w:r>
         <w:tab/>
       </w:r>
@@ -6228,13 +6277,8 @@
         </w:rPr>
       </w:pPr>
       <w:r>
-        <w:t>@</w:t>
-      </w:r>
-      <w:proofErr w:type="spellStart"/>
-      <w:r>
-        <w:t>forvalue</w:t>
-      </w:r>
-      <w:proofErr w:type="spellEnd"/>
+        <w:t>@forvalue</w:t>
+      </w:r>
       <w:r>
         <w:tab/>
       </w:r>
@@ -6318,7 +6362,7 @@
           <w:smallCaps w:val="0"/>
         </w:rPr>
       </w:pPr>
-      <w:bookmarkStart w:id="48" w:name="_Toc516835529"/>
+      <w:bookmarkStart w:id="52" w:name="_Toc516835529"/>
       <w:r>
         <w:rPr>
           <w:bCs w:val="0"/>
@@ -6334,7 +6378,7 @@
         </w:rPr>
         <w:t>PropertyTypes</w:t>
       </w:r>
-      <w:bookmarkEnd w:id="48"/>
+      <w:bookmarkEnd w:id="52"/>
       <w:proofErr w:type="spellEnd"/>
     </w:p>
     <w:p>
@@ -6641,7 +6685,7 @@
         <w:t>createdDate</w:t>
       </w:r>
       <w:proofErr w:type="spellEnd"/>
-      <w:ins w:id="49" w:author="Author">
+      <w:ins w:id="53" w:author="Author">
         <w:r>
           <w:rPr>
             <w:b/>
@@ -6721,12 +6765,12 @@
         <w:pStyle w:val="Heading2"/>
         <w:ind w:left="540" w:hanging="540"/>
       </w:pPr>
-      <w:bookmarkStart w:id="50" w:name="_Toc516835530"/>
+      <w:bookmarkStart w:id="54" w:name="_Toc516835530"/>
       <w:r>
         <w:lastRenderedPageBreak/>
         <w:t>New Attributes</w:t>
       </w:r>
-      <w:bookmarkEnd w:id="50"/>
+      <w:bookmarkEnd w:id="54"/>
     </w:p>
     <w:p>
       <w:r>
@@ -6873,15 +6917,7 @@
         </w:rPr>
       </w:pPr>
       <w:r>
-        <w:t>@</w:t>
-      </w:r>
-      <w:proofErr w:type="spellStart"/>
-      <w:r>
-        <w:t>verticalSpace</w:t>
-      </w:r>
-      <w:proofErr w:type="spellEnd"/>
-      <w:r>
-        <w:t xml:space="preserve"> </w:t>
+        <w:t xml:space="preserve">@verticalSpace </w:t>
       </w:r>
       <w:r>
         <w:tab/>
@@ -6898,23 +6934,9 @@
         <w:rPr>
           <w:i/>
         </w:rPr>
-        <w:t xml:space="preserve"> @</w:t>
-      </w:r>
-      <w:proofErr w:type="spellStart"/>
-      <w:r>
-        <w:rPr>
-          <w:i/>
-        </w:rPr>
-        <w:t>verticalSpace</w:t>
-      </w:r>
-      <w:proofErr w:type="spellEnd"/>
-      <w:r>
-        <w:rPr>
-          <w:i/>
-        </w:rPr>
-        <w:t xml:space="preserve"> attribute </w:t>
-      </w:r>
-      <w:ins w:id="51" w:author="Author">
+        <w:t xml:space="preserve"> @verticalSpace attribute </w:t>
+      </w:r>
+      <w:ins w:id="55" w:author="Author">
         <w:r>
           <w:rPr>
             <w:i/>
@@ -6928,7 +6950,7 @@
         </w:rPr>
         <w:t xml:space="preserve">the amount of vertical space </w:t>
       </w:r>
-      <w:ins w:id="52" w:author="Author">
+      <w:ins w:id="56" w:author="Author">
         <w:r>
           <w:rPr>
             <w:i/>
@@ -6950,7 +6972,7 @@
           <w:t>&gt;) element</w:t>
         </w:r>
       </w:ins>
-      <w:del w:id="53" w:author="Author">
+      <w:del w:id="57" w:author="Author">
         <w:r>
           <w:rPr>
             <w:i/>
@@ -6964,7 +6986,7 @@
         </w:rPr>
         <w:t xml:space="preserve">. If the attribute is not present, single line (i.e. the next line) is the default. If the attribute is present, the value is </w:t>
       </w:r>
-      <w:ins w:id="54" w:author="Author">
+      <w:ins w:id="58" w:author="Author">
         <w:r>
           <w:rPr>
             <w:i/>
@@ -7016,7 +7038,7 @@
         <w:spacing w:line="240" w:lineRule="auto"/>
         <w:ind w:left="1170" w:hanging="1170"/>
         <w:rPr>
-          <w:ins w:id="55" w:author="Author"/>
+          <w:ins w:id="59" w:author="Author"/>
           <w:i/>
         </w:rPr>
       </w:pPr>
@@ -7090,7 +7112,7 @@
       </w:r>
     </w:p>
     <w:p>
-      <w:ins w:id="56" w:author="Author">
+      <w:ins w:id="60" w:author="Author">
         <w:r>
           <w:t>In addition to these USLM attributes, attributes from other namespaces are allowed in various elements, including table elements.</w:t>
         </w:r>
@@ -7111,14 +7133,14 @@
         <w:pStyle w:val="Heading2"/>
         <w:ind w:left="540" w:hanging="540"/>
       </w:pPr>
-      <w:bookmarkStart w:id="57" w:name="_Toc516835531"/>
+      <w:bookmarkStart w:id="61" w:name="_Toc516835531"/>
       <w:r>
         <w:t xml:space="preserve">Model </w:t>
       </w:r>
       <w:r>
         <w:t>Extensions</w:t>
       </w:r>
-      <w:bookmarkEnd w:id="57"/>
+      <w:bookmarkEnd w:id="61"/>
     </w:p>
     <w:p>
       <w:r>
@@ -7147,12 +7169,12 @@
       <w:pPr>
         <w:pStyle w:val="Heading3"/>
       </w:pPr>
-      <w:bookmarkStart w:id="58" w:name="_Toc516835532"/>
+      <w:bookmarkStart w:id="62" w:name="_Toc516835532"/>
       <w:proofErr w:type="spellStart"/>
       <w:r>
         <w:t>LawDoc</w:t>
       </w:r>
-      <w:bookmarkEnd w:id="58"/>
+      <w:bookmarkEnd w:id="62"/>
       <w:proofErr w:type="spellEnd"/>
     </w:p>
     <w:p>
@@ -7209,7 +7231,7 @@
                     <pic:cNvPicPr/>
                   </pic:nvPicPr>
                   <pic:blipFill>
-                    <a:blip r:embed="rId18"/>
+                    <a:blip r:embed="rId17"/>
                     <a:stretch>
                       <a:fillRect/>
                     </a:stretch>
@@ -7281,12 +7303,12 @@
       <w:r>
         <w:t>&gt;</w:t>
       </w:r>
-      <w:del w:id="59" w:author="Author">
+      <w:del w:id="63" w:author="Author">
         <w:r>
           <w:delText>,</w:delText>
         </w:r>
       </w:del>
-      <w:ins w:id="60" w:author="Author">
+      <w:ins w:id="64" w:author="Author">
         <w:r>
           <w:t>.</w:t>
         </w:r>
@@ -7294,8 +7316,8 @@
       <w:r>
         <w:t xml:space="preserve"> </w:t>
       </w:r>
-      <w:ins w:id="61" w:author="Author">
-        <w:del w:id="62" w:author="Author">
+      <w:ins w:id="65" w:author="Author">
+        <w:del w:id="66" w:author="Author">
           <w:r>
             <w:delText>O</w:delText>
           </w:r>
@@ -7482,11 +7504,11 @@
       <w:pPr>
         <w:pStyle w:val="Heading3"/>
       </w:pPr>
-      <w:bookmarkStart w:id="63" w:name="_Toc516835533"/>
+      <w:bookmarkStart w:id="67" w:name="_Toc516835533"/>
       <w:r>
         <w:t>Level</w:t>
       </w:r>
-      <w:bookmarkEnd w:id="63"/>
+      <w:bookmarkEnd w:id="67"/>
     </w:p>
     <w:p>
       <w:r>
@@ -7527,12 +7549,12 @@
       <w:pPr>
         <w:pStyle w:val="Heading3"/>
       </w:pPr>
-      <w:bookmarkStart w:id="64" w:name="_Toc516835534"/>
+      <w:bookmarkStart w:id="68" w:name="_Toc516835534"/>
       <w:proofErr w:type="spellStart"/>
       <w:r>
         <w:t>HeadingStructure</w:t>
       </w:r>
-      <w:bookmarkEnd w:id="64"/>
+      <w:bookmarkEnd w:id="68"/>
       <w:proofErr w:type="spellEnd"/>
     </w:p>
     <w:p>
@@ -7558,11 +7580,11 @@
       <w:pPr>
         <w:pStyle w:val="Heading3"/>
       </w:pPr>
-      <w:bookmarkStart w:id="65" w:name="_Toc516835535"/>
+      <w:bookmarkStart w:id="69" w:name="_Toc516835535"/>
       <w:r>
         <w:t>Amendments</w:t>
       </w:r>
-      <w:bookmarkEnd w:id="65"/>
+      <w:bookmarkEnd w:id="69"/>
     </w:p>
     <w:p>
       <w:r>
@@ -7607,11 +7629,11 @@
       <w:pPr>
         <w:pStyle w:val="Heading3"/>
       </w:pPr>
-      <w:bookmarkStart w:id="66" w:name="_Toc516835536"/>
+      <w:bookmarkStart w:id="70" w:name="_Toc516835536"/>
       <w:r>
         <w:t>Appendix</w:t>
       </w:r>
-      <w:bookmarkEnd w:id="66"/>
+      <w:bookmarkEnd w:id="70"/>
     </w:p>
     <w:p>
       <w:r>
@@ -7640,11 +7662,11 @@
       <w:pPr>
         <w:pStyle w:val="Heading3"/>
       </w:pPr>
-      <w:bookmarkStart w:id="67" w:name="_Toc516835537"/>
+      <w:bookmarkStart w:id="71" w:name="_Toc516835537"/>
       <w:r>
         <w:t>Signature</w:t>
       </w:r>
-      <w:bookmarkEnd w:id="67"/>
+      <w:bookmarkEnd w:id="71"/>
     </w:p>
     <w:p>
       <w:r>
@@ -7722,7 +7744,7 @@
         <w:pStyle w:val="Heading2"/>
         <w:ind w:left="540" w:hanging="540"/>
       </w:pPr>
-      <w:bookmarkStart w:id="68" w:name="_Toc516835538"/>
+      <w:bookmarkStart w:id="72" w:name="_Toc516835538"/>
       <w:r>
         <w:rPr>
           <w:bCs w:val="0"/>
@@ -7730,7 +7752,7 @@
         </w:rPr>
         <w:t>Tables</w:t>
       </w:r>
-      <w:bookmarkEnd w:id="68"/>
+      <w:bookmarkEnd w:id="72"/>
     </w:p>
     <w:p>
       <w:r>
@@ -7795,7 +7817,7 @@
       <w:r>
         <w:t xml:space="preserve"> Inline</w:t>
       </w:r>
-      <w:ins w:id="69" w:author="Author">
+      <w:ins w:id="73" w:author="Author">
         <w:r>
           <w:t>, p,</w:t>
         </w:r>
@@ -7864,7 +7886,7 @@
         </w:rPr>
         <w:t>, @id, @identifier</w:t>
       </w:r>
-      <w:ins w:id="70" w:author="Author">
+      <w:ins w:id="74" w:author="Author">
         <w:r>
           <w:rPr>
             <w:b/>
@@ -7882,7 +7904,7 @@
           <w:smallCaps w:val="0"/>
         </w:rPr>
       </w:pPr>
-      <w:bookmarkStart w:id="71" w:name="_Toc516835539"/>
+      <w:bookmarkStart w:id="75" w:name="_Toc516835539"/>
       <w:r>
         <w:rPr>
           <w:bCs w:val="0"/>
@@ -7890,7 +7912,7 @@
         </w:rPr>
         <w:t>Document Actions</w:t>
       </w:r>
-      <w:bookmarkEnd w:id="71"/>
+      <w:bookmarkEnd w:id="75"/>
     </w:p>
     <w:p>
       <w:r>
@@ -7940,7 +7962,7 @@
       <w:r>
         <w:t xml:space="preserve">, </w:t>
       </w:r>
-      <w:del w:id="72" w:author="Author">
+      <w:del w:id="76" w:author="Author">
         <w:r>
           <w:delText xml:space="preserve">and </w:delText>
         </w:r>
@@ -7965,7 +7987,7 @@
         </w:rPr>
         <w:t>&gt;</w:t>
       </w:r>
-      <w:ins w:id="73" w:author="Author">
+      <w:ins w:id="77" w:author="Author">
         <w:r>
           <w:rPr>
             <w:b/>
@@ -8236,7 +8258,7 @@
           <w:smallCaps w:val="0"/>
         </w:rPr>
       </w:pPr>
-      <w:bookmarkStart w:id="74" w:name="_Toc516835540"/>
+      <w:bookmarkStart w:id="78" w:name="_Toc516835540"/>
       <w:r>
         <w:rPr>
           <w:bCs w:val="0"/>
@@ -8258,7 +8280,7 @@
         </w:rPr>
         <w:t>Titles</w:t>
       </w:r>
-      <w:bookmarkEnd w:id="74"/>
+      <w:bookmarkEnd w:id="78"/>
     </w:p>
     <w:p>
       <w:r>
@@ -8649,7 +8671,7 @@
           <w:smallCaps w:val="0"/>
         </w:rPr>
       </w:pPr>
-      <w:bookmarkStart w:id="75" w:name="_Toc516835541"/>
+      <w:bookmarkStart w:id="79" w:name="_Toc516835541"/>
       <w:r>
         <w:rPr>
           <w:bCs w:val="0"/>
@@ -8657,7 +8679,7 @@
         </w:rPr>
         <w:t>Content Tagging</w:t>
       </w:r>
-      <w:bookmarkEnd w:id="75"/>
+      <w:bookmarkEnd w:id="79"/>
     </w:p>
     <w:p>
       <w:r>
@@ -8695,7 +8717,35 @@
         <w:rPr>
           <w:i/>
         </w:rPr>
-        <w:t xml:space="preserve">A &lt;term&gt; is a word or phrase that is being defined. The &lt;term&gt; element surrounds the words for the term being defined. It is quite possible for multiple &lt;term&gt; elements to be specified within a definition. When a &lt;term&gt; is the words, in the alternate language, then the </w:t>
+        <w:t xml:space="preserve">A &lt;term&gt; is a word or phrase that is being defined. The &lt;term&gt; element surrounds the words for the term being defined. It is quite possible for multiple &lt;term&gt; elements to be specified within a definition. When </w:t>
+      </w:r>
+      <w:proofErr w:type="gramStart"/>
+      <w:r>
+        <w:rPr>
+          <w:i/>
+        </w:rPr>
+        <w:t>a &lt;</w:t>
+      </w:r>
+      <w:proofErr w:type="gramEnd"/>
+      <w:r>
+        <w:rPr>
+          <w:i/>
+        </w:rPr>
+        <w:t xml:space="preserve">term&gt; is the </w:t>
+      </w:r>
+      <w:proofErr w:type="gramStart"/>
+      <w:r>
+        <w:rPr>
+          <w:i/>
+        </w:rPr>
+        <w:t>words</w:t>
+      </w:r>
+      <w:proofErr w:type="gramEnd"/>
+      <w:r>
+        <w:rPr>
+          <w:i/>
+        </w:rPr>
+        <w:t xml:space="preserve">, in the alternate language, then the </w:t>
       </w:r>
       <w:proofErr w:type="spellStart"/>
       <w:proofErr w:type="gramStart"/>
@@ -8759,7 +8809,7 @@
           <w:smallCaps w:val="0"/>
         </w:rPr>
       </w:pPr>
-      <w:bookmarkStart w:id="76" w:name="_Toc516835542"/>
+      <w:bookmarkStart w:id="80" w:name="_Toc516835542"/>
       <w:r>
         <w:rPr>
           <w:bCs w:val="0"/>
@@ -8767,7 +8817,7 @@
         </w:rPr>
         <w:t>Page and Line Numbering</w:t>
       </w:r>
-      <w:bookmarkEnd w:id="76"/>
+      <w:bookmarkEnd w:id="80"/>
     </w:p>
     <w:p>
       <w:r>
@@ -8843,7 +8893,7 @@
           <w:smallCaps w:val="0"/>
         </w:rPr>
       </w:pPr>
-      <w:bookmarkStart w:id="77" w:name="_Toc516835543"/>
+      <w:bookmarkStart w:id="81" w:name="_Toc516835543"/>
       <w:r>
         <w:rPr>
           <w:bCs w:val="0"/>
@@ -8858,13 +8908,13 @@
         </w:rPr>
         <w:t>New Elements</w:t>
       </w:r>
-      <w:bookmarkEnd w:id="77"/>
+      <w:bookmarkEnd w:id="81"/>
     </w:p>
     <w:p>
       <w:r>
         <w:t>The following new elements were added to support content found in the new document types</w:t>
       </w:r>
-      <w:ins w:id="78" w:author="Author">
+      <w:ins w:id="82" w:author="Author">
         <w:r>
           <w:t xml:space="preserve"> and in new stages of existing document types</w:t>
         </w:r>
@@ -9005,7 +9055,7 @@
           <w:tab w:val="left" w:pos="1800"/>
         </w:tabs>
         <w:rPr>
-          <w:ins w:id="79" w:author="Author"/>
+          <w:ins w:id="83" w:author="Author"/>
         </w:rPr>
       </w:pPr>
       <w:r>
@@ -9092,14 +9142,13 @@
           <w:tab w:val="left" w:pos="1800"/>
         </w:tabs>
       </w:pPr>
-      <w:ins w:id="80" w:author="Author">
+      <w:ins w:id="84" w:author="Author">
         <w:r>
           <w:t>(all doc types)</w:t>
         </w:r>
         <w:r>
           <w:tab/>
         </w:r>
-        <w:bookmarkStart w:id="81" w:name="_GoBack"/>
         <w:r>
           <w:rPr>
             <w:b/>
@@ -9108,17 +9157,16 @@
           <w:t>&lt;attestation&gt;</w:t>
         </w:r>
       </w:ins>
-      <w:bookmarkEnd w:id="81"/>
     </w:p>
     <w:p>
       <w:pPr>
         <w:pStyle w:val="Heading1"/>
       </w:pPr>
-      <w:bookmarkStart w:id="82" w:name="_Toc516835544"/>
+      <w:bookmarkStart w:id="85" w:name="_Toc516835544"/>
       <w:r>
         <w:t>Feedback</w:t>
       </w:r>
-      <w:bookmarkEnd w:id="82"/>
+      <w:bookmarkEnd w:id="85"/>
     </w:p>
     <w:p>
       <w:r>
@@ -9136,7 +9184,7 @@
       <w:r>
         <w:t xml:space="preserve"> a GitHub issue at </w:t>
       </w:r>
-      <w:hyperlink r:id="rId19" w:history="1">
+      <w:hyperlink r:id="rId18" w:history="1">
         <w:r>
           <w:rPr>
             <w:rStyle w:val="Hyperlink"/>
@@ -9152,14 +9200,14 @@
       <w:pPr>
         <w:pStyle w:val="Heading1"/>
       </w:pPr>
-      <w:bookmarkStart w:id="83" w:name="_Ref516750087"/>
-      <w:bookmarkStart w:id="84" w:name="_Toc516835545"/>
+      <w:bookmarkStart w:id="86" w:name="_Ref516750087"/>
+      <w:bookmarkStart w:id="87" w:name="_Toc516835545"/>
       <w:r>
         <w:lastRenderedPageBreak/>
         <w:t>Appendix</w:t>
       </w:r>
-      <w:bookmarkEnd w:id="83"/>
-      <w:bookmarkEnd w:id="84"/>
+      <w:bookmarkEnd w:id="86"/>
+      <w:bookmarkEnd w:id="87"/>
     </w:p>
     <w:p>
       <w:pPr>
@@ -9179,6 +9227,110 @@
             <wp:extent cx="5478449" cy="6438934"/>
             <wp:effectExtent l="0" t="0" r="8255" b="0"/>
             <wp:docPr id="9" name="Picture 9"/>
+            <wp:cNvGraphicFramePr>
+              <a:graphicFrameLocks xmlns:a="http://schemas.openxmlformats.org/drawingml/2006/main" noChangeAspect="1"/>
+            </wp:cNvGraphicFramePr>
+            <a:graphic xmlns:a="http://schemas.openxmlformats.org/drawingml/2006/main">
+              <a:graphicData uri="http://schemas.openxmlformats.org/drawingml/2006/picture">
+                <pic:pic xmlns:pic="http://schemas.openxmlformats.org/drawingml/2006/picture">
+                  <pic:nvPicPr>
+                    <pic:cNvPr id="1" name=""/>
+                    <pic:cNvPicPr/>
+                  </pic:nvPicPr>
+                  <pic:blipFill>
+                    <a:blip r:embed="rId19"/>
+                    <a:stretch>
+                      <a:fillRect/>
+                    </a:stretch>
+                  </pic:blipFill>
+                  <pic:spPr>
+                    <a:xfrm>
+                      <a:off x="0" y="0"/>
+                      <a:ext cx="5557480" cy="6531820"/>
+                    </a:xfrm>
+                    <a:prstGeom prst="rect">
+                      <a:avLst/>
+                    </a:prstGeom>
+                  </pic:spPr>
+                </pic:pic>
+              </a:graphicData>
+            </a:graphic>
+          </wp:inline>
+        </w:drawing>
+      </w:r>
+    </w:p>
+    <w:p>
+      <w:pPr>
+        <w:keepNext/>
+        <w:jc w:val="center"/>
+      </w:pPr>
+      <w:r>
+        <w:t xml:space="preserve">Figure </w:t>
+      </w:r>
+      <w:r>
+        <w:rPr>
+          <w:noProof/>
+        </w:rPr>
+        <w:fldChar w:fldCharType="begin"/>
+      </w:r>
+      <w:r>
+        <w:rPr>
+          <w:noProof/>
+        </w:rPr>
+        <w:instrText xml:space="preserve"> SEQ Figure \* ARABIC </w:instrText>
+      </w:r>
+      <w:r>
+        <w:rPr>
+          <w:noProof/>
+        </w:rPr>
+        <w:fldChar w:fldCharType="separate"/>
+      </w:r>
+      <w:r>
+        <w:rPr>
+          <w:noProof/>
+        </w:rPr>
+        <w:t>1</w:t>
+      </w:r>
+      <w:r>
+        <w:rPr>
+          <w:noProof/>
+        </w:rPr>
+        <w:fldChar w:fldCharType="end"/>
+      </w:r>
+      <w:r>
+        <w:t xml:space="preserve"> Bill Preface</w:t>
+      </w:r>
+    </w:p>
+    <w:p>
+      <w:pPr>
+        <w:tabs>
+          <w:tab w:val="left" w:pos="4410"/>
+        </w:tabs>
+        <w:ind w:left="360"/>
+      </w:pPr>
+      <w:r>
+        <w:t xml:space="preserve">   </w:t>
+      </w:r>
+    </w:p>
+    <w:p>
+      <w:pPr>
+        <w:keepNext/>
+        <w:tabs>
+          <w:tab w:val="left" w:pos="4410"/>
+        </w:tabs>
+        <w:ind w:left="360"/>
+      </w:pPr>
+      <w:r>
+        <w:rPr>
+          <w:noProof/>
+          <w:lang w:val="en-CA" w:eastAsia="en-CA"/>
+        </w:rPr>
+        <w:lastRenderedPageBreak/>
+        <w:drawing>
+          <wp:inline distT="0" distB="0" distL="0" distR="0" wp14:anchorId="55FCA146" wp14:editId="04442D6A">
+            <wp:extent cx="5943600" cy="3394710"/>
+            <wp:effectExtent l="0" t="0" r="0" b="0"/>
+            <wp:docPr id="8" name="Picture 8"/>
             <wp:cNvGraphicFramePr>
               <a:graphicFrameLocks xmlns:a="http://schemas.openxmlformats.org/drawingml/2006/main" noChangeAspect="1"/>
             </wp:cNvGraphicFramePr>
@@ -9198,110 +9350,6 @@
                   <pic:spPr>
                     <a:xfrm>
                       <a:off x="0" y="0"/>
-                      <a:ext cx="5557480" cy="6531820"/>
-                    </a:xfrm>
-                    <a:prstGeom prst="rect">
-                      <a:avLst/>
-                    </a:prstGeom>
-                  </pic:spPr>
-                </pic:pic>
-              </a:graphicData>
-            </a:graphic>
-          </wp:inline>
-        </w:drawing>
-      </w:r>
-    </w:p>
-    <w:p>
-      <w:pPr>
-        <w:keepNext/>
-        <w:jc w:val="center"/>
-      </w:pPr>
-      <w:r>
-        <w:t xml:space="preserve">Figure </w:t>
-      </w:r>
-      <w:r>
-        <w:rPr>
-          <w:noProof/>
-        </w:rPr>
-        <w:fldChar w:fldCharType="begin"/>
-      </w:r>
-      <w:r>
-        <w:rPr>
-          <w:noProof/>
-        </w:rPr>
-        <w:instrText xml:space="preserve"> SEQ Figure \* ARABIC </w:instrText>
-      </w:r>
-      <w:r>
-        <w:rPr>
-          <w:noProof/>
-        </w:rPr>
-        <w:fldChar w:fldCharType="separate"/>
-      </w:r>
-      <w:r>
-        <w:rPr>
-          <w:noProof/>
-        </w:rPr>
-        <w:t>1</w:t>
-      </w:r>
-      <w:r>
-        <w:rPr>
-          <w:noProof/>
-        </w:rPr>
-        <w:fldChar w:fldCharType="end"/>
-      </w:r>
-      <w:r>
-        <w:t xml:space="preserve"> Bill Preface</w:t>
-      </w:r>
-    </w:p>
-    <w:p>
-      <w:pPr>
-        <w:tabs>
-          <w:tab w:val="left" w:pos="4410"/>
-        </w:tabs>
-        <w:ind w:left="360"/>
-      </w:pPr>
-      <w:r>
-        <w:t xml:space="preserve">   </w:t>
-      </w:r>
-    </w:p>
-    <w:p>
-      <w:pPr>
-        <w:keepNext/>
-        <w:tabs>
-          <w:tab w:val="left" w:pos="4410"/>
-        </w:tabs>
-        <w:ind w:left="360"/>
-      </w:pPr>
-      <w:r>
-        <w:rPr>
-          <w:noProof/>
-          <w:lang w:val="en-CA" w:eastAsia="en-CA"/>
-        </w:rPr>
-        <w:lastRenderedPageBreak/>
-        <w:drawing>
-          <wp:inline distT="0" distB="0" distL="0" distR="0" wp14:anchorId="55FCA146" wp14:editId="04442D6A">
-            <wp:extent cx="5943600" cy="3394710"/>
-            <wp:effectExtent l="0" t="0" r="0" b="0"/>
-            <wp:docPr id="8" name="Picture 8"/>
-            <wp:cNvGraphicFramePr>
-              <a:graphicFrameLocks xmlns:a="http://schemas.openxmlformats.org/drawingml/2006/main" noChangeAspect="1"/>
-            </wp:cNvGraphicFramePr>
-            <a:graphic xmlns:a="http://schemas.openxmlformats.org/drawingml/2006/main">
-              <a:graphicData uri="http://schemas.openxmlformats.org/drawingml/2006/picture">
-                <pic:pic xmlns:pic="http://schemas.openxmlformats.org/drawingml/2006/picture">
-                  <pic:nvPicPr>
-                    <pic:cNvPr id="1" name=""/>
-                    <pic:cNvPicPr/>
-                  </pic:nvPicPr>
-                  <pic:blipFill>
-                    <a:blip r:embed="rId21"/>
-                    <a:stretch>
-                      <a:fillRect/>
-                    </a:stretch>
-                  </pic:blipFill>
-                  <pic:spPr>
-                    <a:xfrm>
-                      <a:off x="0" y="0"/>
                       <a:ext cx="5943600" cy="3394710"/>
                     </a:xfrm>
                     <a:prstGeom prst="rect">
@@ -9408,8 +9456,8 @@
       </w:r>
     </w:p>
     <w:sectPr>
-      <w:headerReference w:type="default" r:id="rId22"/>
-      <w:footerReference w:type="default" r:id="rId23"/>
+      <w:headerReference w:type="default" r:id="rId21"/>
+      <w:footerReference w:type="default" r:id="rId22"/>
       <w:pgSz w:w="12240" w:h="15840"/>
       <w:pgMar w:top="1440" w:right="1440" w:bottom="1440" w:left="1440" w:header="720" w:footer="720" w:gutter="0"/>
       <w:cols w:space="720"/>
@@ -9420,7 +9468,7 @@
 </file>
 
 <file path=word/endnotes.xml><?xml version="1.0" encoding="utf-8"?>
-<w:endnotes xmlns:wpc="http://schemas.microsoft.com/office/word/2010/wordprocessingCanvas" xmlns:cx="http://schemas.microsoft.com/office/drawing/2014/chartex" xmlns:cx1="http://schemas.microsoft.com/office/drawing/2015/9/8/chartex" xmlns:cx2="http://schemas.microsoft.com/office/drawing/2015/10/21/chartex" xmlns:cx3="http://schemas.microsoft.com/office/drawing/2016/5/9/chartex" xmlns:cx4="http://schemas.microsoft.com/office/drawing/2016/5/10/chartex" xmlns:cx5="http://schemas.microsoft.com/office/drawing/2016/5/11/chartex" xmlns:cx6="http://schemas.microsoft.com/office/drawing/2016/5/12/chartex" xmlns:cx7="http://schemas.microsoft.com/office/drawing/2016/5/13/chartex" xmlns:cx8="http://schemas.microsoft.com/office/drawing/2016/5/14/chartex" xmlns:mc="http://schemas.openxmlformats.org/markup-compatibility/2006" xmlns:aink="http://schemas.microsoft.com/office/drawing/2016/ink" xmlns:am3d="http://schemas.microsoft.com/office/drawing/2017/model3d" xmlns:o="urn:schemas-microsoft-com:office:office" xmlns:r="http://schemas.openxmlformats.org/officeDocument/2006/relationships" xmlns:m="http://schemas.openxmlformats.org/officeDocument/2006/math" xmlns:v="urn:schemas-microsoft-com:vml" xmlns:wp14="http://schemas.microsoft.com/office/word/2010/wordprocessingDrawing" xmlns:wp="http://schemas.openxmlformats.org/drawingml/2006/wordprocessingDrawing" xmlns:w10="urn:schemas-microsoft-com:office:word" xmlns:w="http://schemas.openxmlformats.org/wordprocessingml/2006/main" xmlns:w14="http://schemas.microsoft.com/office/word/2010/wordml" xmlns:w15="http://schemas.microsoft.com/office/word/2012/wordml" xmlns:w16cid="http://schemas.microsoft.com/office/word/2016/wordml/cid" xmlns:w16se="http://schemas.microsoft.com/office/word/2015/wordml/symex" xmlns:wpg="http://schemas.microsoft.com/office/word/2010/wordprocessingGroup" xmlns:wpi="http://schemas.microsoft.com/office/word/2010/wordprocessingInk" xmlns:wne="http://schemas.microsoft.com/office/word/2006/wordml" xmlns:wps="http://schemas.microsoft.com/office/word/2010/wordprocessingShape" mc:Ignorable="w14 w15 w16se w16cid wp14">
+<w:endnotes xmlns:wpc="http://schemas.microsoft.com/office/word/2010/wordprocessingCanvas" xmlns:cx="http://schemas.microsoft.com/office/drawing/2014/chartex" xmlns:cx1="http://schemas.microsoft.com/office/drawing/2015/9/8/chartex" xmlns:cx2="http://schemas.microsoft.com/office/drawing/2015/10/21/chartex" xmlns:cx3="http://schemas.microsoft.com/office/drawing/2016/5/9/chartex" xmlns:cx4="http://schemas.microsoft.com/office/drawing/2016/5/10/chartex" xmlns:cx5="http://schemas.microsoft.com/office/drawing/2016/5/11/chartex" xmlns:cx6="http://schemas.microsoft.com/office/drawing/2016/5/12/chartex" xmlns:cx7="http://schemas.microsoft.com/office/drawing/2016/5/13/chartex" xmlns:cx8="http://schemas.microsoft.com/office/drawing/2016/5/14/chartex" xmlns:mc="http://schemas.openxmlformats.org/markup-compatibility/2006" xmlns:aink="http://schemas.microsoft.com/office/drawing/2016/ink" xmlns:am3d="http://schemas.microsoft.com/office/drawing/2017/model3d" xmlns:o="urn:schemas-microsoft-com:office:office" xmlns:oel="http://schemas.microsoft.com/office/2019/extlst" xmlns:r="http://schemas.openxmlformats.org/officeDocument/2006/relationships" xmlns:m="http://schemas.openxmlformats.org/officeDocument/2006/math" xmlns:v="urn:schemas-microsoft-com:vml" xmlns:wp14="http://schemas.microsoft.com/office/word/2010/wordprocessingDrawing" xmlns:wp="http://schemas.openxmlformats.org/drawingml/2006/wordprocessingDrawing" xmlns:w10="urn:schemas-microsoft-com:office:word" xmlns:w="http://schemas.openxmlformats.org/wordprocessingml/2006/main" xmlns:w14="http://schemas.microsoft.com/office/word/2010/wordml" xmlns:w15="http://schemas.microsoft.com/office/word/2012/wordml" xmlns:w16cex="http://schemas.microsoft.com/office/word/2018/wordml/cex" xmlns:w16cid="http://schemas.microsoft.com/office/word/2016/wordml/cid" xmlns:w16="http://schemas.microsoft.com/office/word/2018/wordml" xmlns:w16du="http://schemas.microsoft.com/office/word/2023/wordml/word16du" xmlns:w16sdtdh="http://schemas.microsoft.com/office/word/2020/wordml/sdtdatahash" xmlns:w16sdtfl="http://schemas.microsoft.com/office/word/2024/wordml/sdtformatlock" xmlns:w16se="http://schemas.microsoft.com/office/word/2015/wordml/symex" xmlns:wpg="http://schemas.microsoft.com/office/word/2010/wordprocessingGroup" xmlns:wpi="http://schemas.microsoft.com/office/word/2010/wordprocessingInk" xmlns:wne="http://schemas.microsoft.com/office/word/2006/wordml" xmlns:wps="http://schemas.microsoft.com/office/word/2010/wordprocessingShape" mc:Ignorable="w14 w15 w16se w16cid w16 w16cex w16sdtdh w16sdtfl w16du wp14">
   <w:endnote w:type="separator" w:id="-1">
     <w:p>
       <w:pPr>
@@ -9452,7 +9500,7 @@
 </file>
 
 <file path=word/footer1.xml><?xml version="1.0" encoding="utf-8"?>
-<w:ftr xmlns:wpc="http://schemas.microsoft.com/office/word/2010/wordprocessingCanvas" xmlns:cx="http://schemas.microsoft.com/office/drawing/2014/chartex" xmlns:cx1="http://schemas.microsoft.com/office/drawing/2015/9/8/chartex" xmlns:cx2="http://schemas.microsoft.com/office/drawing/2015/10/21/chartex" xmlns:cx3="http://schemas.microsoft.com/office/drawing/2016/5/9/chartex" xmlns:cx4="http://schemas.microsoft.com/office/drawing/2016/5/10/chartex" xmlns:cx5="http://schemas.microsoft.com/office/drawing/2016/5/11/chartex" xmlns:cx6="http://schemas.microsoft.com/office/drawing/2016/5/12/chartex" xmlns:cx7="http://schemas.microsoft.com/office/drawing/2016/5/13/chartex" xmlns:cx8="http://schemas.microsoft.com/office/drawing/2016/5/14/chartex" xmlns:mc="http://schemas.openxmlformats.org/markup-compatibility/2006" xmlns:aink="http://schemas.microsoft.com/office/drawing/2016/ink" xmlns:am3d="http://schemas.microsoft.com/office/drawing/2017/model3d" xmlns:o="urn:schemas-microsoft-com:office:office" xmlns:r="http://schemas.openxmlformats.org/officeDocument/2006/relationships" xmlns:m="http://schemas.openxmlformats.org/officeDocument/2006/math" xmlns:v="urn:schemas-microsoft-com:vml" xmlns:wp14="http://schemas.microsoft.com/office/word/2010/wordprocessingDrawing" xmlns:wp="http://schemas.openxmlformats.org/drawingml/2006/wordprocessingDrawing" xmlns:w10="urn:schemas-microsoft-com:office:word" xmlns:w="http://schemas.openxmlformats.org/wordprocessingml/2006/main" xmlns:w14="http://schemas.microsoft.com/office/word/2010/wordml" xmlns:w15="http://schemas.microsoft.com/office/word/2012/wordml" xmlns:w16cid="http://schemas.microsoft.com/office/word/2016/wordml/cid" xmlns:w16se="http://schemas.microsoft.com/office/word/2015/wordml/symex" xmlns:wpg="http://schemas.microsoft.com/office/word/2010/wordprocessingGroup" xmlns:wpi="http://schemas.microsoft.com/office/word/2010/wordprocessingInk" xmlns:wne="http://schemas.microsoft.com/office/word/2006/wordml" xmlns:wps="http://schemas.microsoft.com/office/word/2010/wordprocessingShape" mc:Ignorable="w14 w15 w16se w16cid wp14">
+<w:ftr xmlns:wpc="http://schemas.microsoft.com/office/word/2010/wordprocessingCanvas" xmlns:cx="http://schemas.microsoft.com/office/drawing/2014/chartex" xmlns:cx1="http://schemas.microsoft.com/office/drawing/2015/9/8/chartex" xmlns:cx2="http://schemas.microsoft.com/office/drawing/2015/10/21/chartex" xmlns:cx3="http://schemas.microsoft.com/office/drawing/2016/5/9/chartex" xmlns:cx4="http://schemas.microsoft.com/office/drawing/2016/5/10/chartex" xmlns:cx5="http://schemas.microsoft.com/office/drawing/2016/5/11/chartex" xmlns:cx6="http://schemas.microsoft.com/office/drawing/2016/5/12/chartex" xmlns:cx7="http://schemas.microsoft.com/office/drawing/2016/5/13/chartex" xmlns:cx8="http://schemas.microsoft.com/office/drawing/2016/5/14/chartex" xmlns:mc="http://schemas.openxmlformats.org/markup-compatibility/2006" xmlns:aink="http://schemas.microsoft.com/office/drawing/2016/ink" xmlns:am3d="http://schemas.microsoft.com/office/drawing/2017/model3d" xmlns:o="urn:schemas-microsoft-com:office:office" xmlns:oel="http://schemas.microsoft.com/office/2019/extlst" xmlns:r="http://schemas.openxmlformats.org/officeDocument/2006/relationships" xmlns:m="http://schemas.openxmlformats.org/officeDocument/2006/math" xmlns:v="urn:schemas-microsoft-com:vml" xmlns:wp14="http://schemas.microsoft.com/office/word/2010/wordprocessingDrawing" xmlns:wp="http://schemas.openxmlformats.org/drawingml/2006/wordprocessingDrawing" xmlns:w10="urn:schemas-microsoft-com:office:word" xmlns:w="http://schemas.openxmlformats.org/wordprocessingml/2006/main" xmlns:w14="http://schemas.microsoft.com/office/word/2010/wordml" xmlns:w15="http://schemas.microsoft.com/office/word/2012/wordml" xmlns:w16cex="http://schemas.microsoft.com/office/word/2018/wordml/cex" xmlns:w16cid="http://schemas.microsoft.com/office/word/2016/wordml/cid" xmlns:w16="http://schemas.microsoft.com/office/word/2018/wordml" xmlns:w16du="http://schemas.microsoft.com/office/word/2023/wordml/word16du" xmlns:w16sdtdh="http://schemas.microsoft.com/office/word/2020/wordml/sdtdatahash" xmlns:w16sdtfl="http://schemas.microsoft.com/office/word/2024/wordml/sdtformatlock" xmlns:w16se="http://schemas.microsoft.com/office/word/2015/wordml/symex" xmlns:wpg="http://schemas.microsoft.com/office/word/2010/wordprocessingGroup" xmlns:wpi="http://schemas.microsoft.com/office/word/2010/wordprocessingInk" xmlns:wne="http://schemas.microsoft.com/office/word/2006/wordml" xmlns:wps="http://schemas.microsoft.com/office/word/2010/wordprocessingShape" mc:Ignorable="w14 w15 w16se w16cid w16 w16cex w16sdtdh w16sdtfl w16du wp14">
   <w:sdt>
     <w:sdtPr>
       <w:id w:val="1269661844"/>
@@ -9506,7 +9554,7 @@
 </file>
 
 <file path=word/footnotes.xml><?xml version="1.0" encoding="utf-8"?>
-<w:footnotes xmlns:wpc="http://schemas.microsoft.com/office/word/2010/wordprocessingCanvas" xmlns:cx="http://schemas.microsoft.com/office/drawing/2014/chartex" xmlns:cx1="http://schemas.microsoft.com/office/drawing/2015/9/8/chartex" xmlns:cx2="http://schemas.microsoft.com/office/drawing/2015/10/21/chartex" xmlns:cx3="http://schemas.microsoft.com/office/drawing/2016/5/9/chartex" xmlns:cx4="http://schemas.microsoft.com/office/drawing/2016/5/10/chartex" xmlns:cx5="http://schemas.microsoft.com/office/drawing/2016/5/11/chartex" xmlns:cx6="http://schemas.microsoft.com/office/drawing/2016/5/12/chartex" xmlns:cx7="http://schemas.microsoft.com/office/drawing/2016/5/13/chartex" xmlns:cx8="http://schemas.microsoft.com/office/drawing/2016/5/14/chartex" xmlns:mc="http://schemas.openxmlformats.org/markup-compatibility/2006" xmlns:aink="http://schemas.microsoft.com/office/drawing/2016/ink" xmlns:am3d="http://schemas.microsoft.com/office/drawing/2017/model3d" xmlns:o="urn:schemas-microsoft-com:office:office" xmlns:r="http://schemas.openxmlformats.org/officeDocument/2006/relationships" xmlns:m="http://schemas.openxmlformats.org/officeDocument/2006/math" xmlns:v="urn:schemas-microsoft-com:vml" xmlns:wp14="http://schemas.microsoft.com/office/word/2010/wordprocessingDrawing" xmlns:wp="http://schemas.openxmlformats.org/drawingml/2006/wordprocessingDrawing" xmlns:w10="urn:schemas-microsoft-com:office:word" xmlns:w="http://schemas.openxmlformats.org/wordprocessingml/2006/main" xmlns:w14="http://schemas.microsoft.com/office/word/2010/wordml" xmlns:w15="http://schemas.microsoft.com/office/word/2012/wordml" xmlns:w16cid="http://schemas.microsoft.com/office/word/2016/wordml/cid" xmlns:w16se="http://schemas.microsoft.com/office/word/2015/wordml/symex" xmlns:wpg="http://schemas.microsoft.com/office/word/2010/wordprocessingGroup" xmlns:wpi="http://schemas.microsoft.com/office/word/2010/wordprocessingInk" xmlns:wne="http://schemas.microsoft.com/office/word/2006/wordml" xmlns:wps="http://schemas.microsoft.com/office/word/2010/wordprocessingShape" mc:Ignorable="w14 w15 w16se w16cid wp14">
+<w:footnotes xmlns:wpc="http://schemas.microsoft.com/office/word/2010/wordprocessingCanvas" xmlns:cx="http://schemas.microsoft.com/office/drawing/2014/chartex" xmlns:cx1="http://schemas.microsoft.com/office/drawing/2015/9/8/chartex" xmlns:cx2="http://schemas.microsoft.com/office/drawing/2015/10/21/chartex" xmlns:cx3="http://schemas.microsoft.com/office/drawing/2016/5/9/chartex" xmlns:cx4="http://schemas.microsoft.com/office/drawing/2016/5/10/chartex" xmlns:cx5="http://schemas.microsoft.com/office/drawing/2016/5/11/chartex" xmlns:cx6="http://schemas.microsoft.com/office/drawing/2016/5/12/chartex" xmlns:cx7="http://schemas.microsoft.com/office/drawing/2016/5/13/chartex" xmlns:cx8="http://schemas.microsoft.com/office/drawing/2016/5/14/chartex" xmlns:mc="http://schemas.openxmlformats.org/markup-compatibility/2006" xmlns:aink="http://schemas.microsoft.com/office/drawing/2016/ink" xmlns:am3d="http://schemas.microsoft.com/office/drawing/2017/model3d" xmlns:o="urn:schemas-microsoft-com:office:office" xmlns:oel="http://schemas.microsoft.com/office/2019/extlst" xmlns:r="http://schemas.openxmlformats.org/officeDocument/2006/relationships" xmlns:m="http://schemas.openxmlformats.org/officeDocument/2006/math" xmlns:v="urn:schemas-microsoft-com:vml" xmlns:wp14="http://schemas.microsoft.com/office/word/2010/wordprocessingDrawing" xmlns:wp="http://schemas.openxmlformats.org/drawingml/2006/wordprocessingDrawing" xmlns:w10="urn:schemas-microsoft-com:office:word" xmlns:w="http://schemas.openxmlformats.org/wordprocessingml/2006/main" xmlns:w14="http://schemas.microsoft.com/office/word/2010/wordml" xmlns:w15="http://schemas.microsoft.com/office/word/2012/wordml" xmlns:w16cex="http://schemas.microsoft.com/office/word/2018/wordml/cex" xmlns:w16cid="http://schemas.microsoft.com/office/word/2016/wordml/cid" xmlns:w16="http://schemas.microsoft.com/office/word/2018/wordml" xmlns:w16du="http://schemas.microsoft.com/office/word/2023/wordml/word16du" xmlns:w16sdtdh="http://schemas.microsoft.com/office/word/2020/wordml/sdtdatahash" xmlns:w16sdtfl="http://schemas.microsoft.com/office/word/2024/wordml/sdtformatlock" xmlns:w16se="http://schemas.microsoft.com/office/word/2015/wordml/symex" xmlns:wpg="http://schemas.microsoft.com/office/word/2010/wordprocessingGroup" xmlns:wpi="http://schemas.microsoft.com/office/word/2010/wordprocessingInk" xmlns:wne="http://schemas.microsoft.com/office/word/2006/wordml" xmlns:wps="http://schemas.microsoft.com/office/word/2010/wordprocessingShape" mc:Ignorable="w14 w15 w16se w16cid w16 w16cex w16sdtdh w16sdtfl w16du wp14">
   <w:footnote w:type="separator" w:id="-1">
     <w:p>
       <w:pPr>
@@ -9576,7 +9624,7 @@
 </file>
 
 <file path=word/header1.xml><?xml version="1.0" encoding="utf-8"?>
-<w:hdr xmlns:wpc="http://schemas.microsoft.com/office/word/2010/wordprocessingCanvas" xmlns:cx="http://schemas.microsoft.com/office/drawing/2014/chartex" xmlns:cx1="http://schemas.microsoft.com/office/drawing/2015/9/8/chartex" xmlns:cx2="http://schemas.microsoft.com/office/drawing/2015/10/21/chartex" xmlns:cx3="http://schemas.microsoft.com/office/drawing/2016/5/9/chartex" xmlns:cx4="http://schemas.microsoft.com/office/drawing/2016/5/10/chartex" xmlns:cx5="http://schemas.microsoft.com/office/drawing/2016/5/11/chartex" xmlns:cx6="http://schemas.microsoft.com/office/drawing/2016/5/12/chartex" xmlns:cx7="http://schemas.microsoft.com/office/drawing/2016/5/13/chartex" xmlns:cx8="http://schemas.microsoft.com/office/drawing/2016/5/14/chartex" xmlns:mc="http://schemas.openxmlformats.org/markup-compatibility/2006" xmlns:aink="http://schemas.microsoft.com/office/drawing/2016/ink" xmlns:am3d="http://schemas.microsoft.com/office/drawing/2017/model3d" xmlns:o="urn:schemas-microsoft-com:office:office" xmlns:r="http://schemas.openxmlformats.org/officeDocument/2006/relationships" xmlns:m="http://schemas.openxmlformats.org/officeDocument/2006/math" xmlns:v="urn:schemas-microsoft-com:vml" xmlns:wp14="http://schemas.microsoft.com/office/word/2010/wordprocessingDrawing" xmlns:wp="http://schemas.openxmlformats.org/drawingml/2006/wordprocessingDrawing" xmlns:w10="urn:schemas-microsoft-com:office:word" xmlns:w="http://schemas.openxmlformats.org/wordprocessingml/2006/main" xmlns:w14="http://schemas.microsoft.com/office/word/2010/wordml" xmlns:w15="http://schemas.microsoft.com/office/word/2012/wordml" xmlns:w16cid="http://schemas.microsoft.com/office/word/2016/wordml/cid" xmlns:w16se="http://schemas.microsoft.com/office/word/2015/wordml/symex" xmlns:wpg="http://schemas.microsoft.com/office/word/2010/wordprocessingGroup" xmlns:wpi="http://schemas.microsoft.com/office/word/2010/wordprocessingInk" xmlns:wne="http://schemas.microsoft.com/office/word/2006/wordml" xmlns:wps="http://schemas.microsoft.com/office/word/2010/wordprocessingShape" mc:Ignorable="w14 w15 w16se w16cid wp14">
+<w:hdr xmlns:wpc="http://schemas.microsoft.com/office/word/2010/wordprocessingCanvas" xmlns:cx="http://schemas.microsoft.com/office/drawing/2014/chartex" xmlns:cx1="http://schemas.microsoft.com/office/drawing/2015/9/8/chartex" xmlns:cx2="http://schemas.microsoft.com/office/drawing/2015/10/21/chartex" xmlns:cx3="http://schemas.microsoft.com/office/drawing/2016/5/9/chartex" xmlns:cx4="http://schemas.microsoft.com/office/drawing/2016/5/10/chartex" xmlns:cx5="http://schemas.microsoft.com/office/drawing/2016/5/11/chartex" xmlns:cx6="http://schemas.microsoft.com/office/drawing/2016/5/12/chartex" xmlns:cx7="http://schemas.microsoft.com/office/drawing/2016/5/13/chartex" xmlns:cx8="http://schemas.microsoft.com/office/drawing/2016/5/14/chartex" xmlns:mc="http://schemas.openxmlformats.org/markup-compatibility/2006" xmlns:aink="http://schemas.microsoft.com/office/drawing/2016/ink" xmlns:am3d="http://schemas.microsoft.com/office/drawing/2017/model3d" xmlns:o="urn:schemas-microsoft-com:office:office" xmlns:oel="http://schemas.microsoft.com/office/2019/extlst" xmlns:r="http://schemas.openxmlformats.org/officeDocument/2006/relationships" xmlns:m="http://schemas.openxmlformats.org/officeDocument/2006/math" xmlns:v="urn:schemas-microsoft-com:vml" xmlns:wp14="http://schemas.microsoft.com/office/word/2010/wordprocessingDrawing" xmlns:wp="http://schemas.openxmlformats.org/drawingml/2006/wordprocessingDrawing" xmlns:w10="urn:schemas-microsoft-com:office:word" xmlns:w="http://schemas.openxmlformats.org/wordprocessingml/2006/main" xmlns:w14="http://schemas.microsoft.com/office/word/2010/wordml" xmlns:w15="http://schemas.microsoft.com/office/word/2012/wordml" xmlns:w16cex="http://schemas.microsoft.com/office/word/2018/wordml/cex" xmlns:w16cid="http://schemas.microsoft.com/office/word/2016/wordml/cid" xmlns:w16="http://schemas.microsoft.com/office/word/2018/wordml" xmlns:w16du="http://schemas.microsoft.com/office/word/2023/wordml/word16du" xmlns:w16sdtdh="http://schemas.microsoft.com/office/word/2020/wordml/sdtdatahash" xmlns:w16sdtfl="http://schemas.microsoft.com/office/word/2024/wordml/sdtformatlock" xmlns:w16se="http://schemas.microsoft.com/office/word/2015/wordml/symex" xmlns:wpg="http://schemas.microsoft.com/office/word/2010/wordprocessingGroup" xmlns:wpi="http://schemas.microsoft.com/office/word/2010/wordprocessingInk" xmlns:wne="http://schemas.microsoft.com/office/word/2006/wordml" xmlns:wps="http://schemas.microsoft.com/office/word/2010/wordprocessingShape" mc:Ignorable="w14 w15 w16se w16cid w16 w16cex w16sdtdh w16sdtfl w16du wp14">
   <w:p>
     <w:pPr>
       <w:pStyle w:val="Header"/>
@@ -9620,7 +9668,7 @@
 </file>
 
 <file path=word/numbering.xml><?xml version="1.0" encoding="utf-8"?>
-<w:numbering xmlns:wpc="http://schemas.microsoft.com/office/word/2010/wordprocessingCanvas" xmlns:cx="http://schemas.microsoft.com/office/drawing/2014/chartex" xmlns:cx1="http://schemas.microsoft.com/office/drawing/2015/9/8/chartex" xmlns:cx2="http://schemas.microsoft.com/office/drawing/2015/10/21/chartex" xmlns:cx3="http://schemas.microsoft.com/office/drawing/2016/5/9/chartex" xmlns:cx4="http://schemas.microsoft.com/office/drawing/2016/5/10/chartex" xmlns:cx5="http://schemas.microsoft.com/office/drawing/2016/5/11/chartex" xmlns:cx6="http://schemas.microsoft.com/office/drawing/2016/5/12/chartex" xmlns:cx7="http://schemas.microsoft.com/office/drawing/2016/5/13/chartex" xmlns:cx8="http://schemas.microsoft.com/office/drawing/2016/5/14/chartex" xmlns:mc="http://schemas.openxmlformats.org/markup-compatibility/2006" xmlns:aink="http://schemas.microsoft.com/office/drawing/2016/ink" xmlns:am3d="http://schemas.microsoft.com/office/drawing/2017/model3d" xmlns:o="urn:schemas-microsoft-com:office:office" xmlns:r="http://schemas.openxmlformats.org/officeDocument/2006/relationships" xmlns:m="http://schemas.openxmlformats.org/officeDocument/2006/math" xmlns:v="urn:schemas-microsoft-com:vml" xmlns:wp14="http://schemas.microsoft.com/office/word/2010/wordprocessingDrawing" xmlns:wp="http://schemas.openxmlformats.org/drawingml/2006/wordprocessingDrawing" xmlns:w10="urn:schemas-microsoft-com:office:word" xmlns:w="http://schemas.openxmlformats.org/wordprocessingml/2006/main" xmlns:w14="http://schemas.microsoft.com/office/word/2010/wordml" xmlns:w15="http://schemas.microsoft.com/office/word/2012/wordml" xmlns:w16cid="http://schemas.microsoft.com/office/word/2016/wordml/cid" xmlns:w16se="http://schemas.microsoft.com/office/word/2015/wordml/symex" xmlns:wpg="http://schemas.microsoft.com/office/word/2010/wordprocessingGroup" xmlns:wpi="http://schemas.microsoft.com/office/word/2010/wordprocessingInk" xmlns:wne="http://schemas.microsoft.com/office/word/2006/wordml" xmlns:wps="http://schemas.microsoft.com/office/word/2010/wordprocessingShape" mc:Ignorable="w14 w15 w16se w16cid wp14">
+<w:numbering xmlns:wpc="http://schemas.microsoft.com/office/word/2010/wordprocessingCanvas" xmlns:cx="http://schemas.microsoft.com/office/drawing/2014/chartex" xmlns:cx1="http://schemas.microsoft.com/office/drawing/2015/9/8/chartex" xmlns:cx2="http://schemas.microsoft.com/office/drawing/2015/10/21/chartex" xmlns:cx3="http://schemas.microsoft.com/office/drawing/2016/5/9/chartex" xmlns:cx4="http://schemas.microsoft.com/office/drawing/2016/5/10/chartex" xmlns:cx5="http://schemas.microsoft.com/office/drawing/2016/5/11/chartex" xmlns:cx6="http://schemas.microsoft.com/office/drawing/2016/5/12/chartex" xmlns:cx7="http://schemas.microsoft.com/office/drawing/2016/5/13/chartex" xmlns:cx8="http://schemas.microsoft.com/office/drawing/2016/5/14/chartex" xmlns:mc="http://schemas.openxmlformats.org/markup-compatibility/2006" xmlns:aink="http://schemas.microsoft.com/office/drawing/2016/ink" xmlns:am3d="http://schemas.microsoft.com/office/drawing/2017/model3d" xmlns:o="urn:schemas-microsoft-com:office:office" xmlns:oel="http://schemas.microsoft.com/office/2019/extlst" xmlns:r="http://schemas.openxmlformats.org/officeDocument/2006/relationships" xmlns:m="http://schemas.openxmlformats.org/officeDocument/2006/math" xmlns:v="urn:schemas-microsoft-com:vml" xmlns:wp14="http://schemas.microsoft.com/office/word/2010/wordprocessingDrawing" xmlns:wp="http://schemas.openxmlformats.org/drawingml/2006/wordprocessingDrawing" xmlns:w10="urn:schemas-microsoft-com:office:word" xmlns:w="http://schemas.openxmlformats.org/wordprocessingml/2006/main" xmlns:w14="http://schemas.microsoft.com/office/word/2010/wordml" xmlns:w15="http://schemas.microsoft.com/office/word/2012/wordml" xmlns:w16cex="http://schemas.microsoft.com/office/word/2018/wordml/cex" xmlns:w16cid="http://schemas.microsoft.com/office/word/2016/wordml/cid" xmlns:w16="http://schemas.microsoft.com/office/word/2018/wordml" xmlns:w16du="http://schemas.microsoft.com/office/word/2023/wordml/word16du" xmlns:w16sdtdh="http://schemas.microsoft.com/office/word/2020/wordml/sdtdatahash" xmlns:w16sdtfl="http://schemas.microsoft.com/office/word/2024/wordml/sdtformatlock" xmlns:w16se="http://schemas.microsoft.com/office/word/2015/wordml/symex" xmlns:wpg="http://schemas.microsoft.com/office/word/2010/wordprocessingGroup" xmlns:wpi="http://schemas.microsoft.com/office/word/2010/wordprocessingInk" xmlns:wne="http://schemas.microsoft.com/office/word/2006/wordml" xmlns:wps="http://schemas.microsoft.com/office/word/2010/wordprocessingShape" mc:Ignorable="w14 w15 w16se w16cid w16 w16cex w16sdtdh w16sdtfl w16du wp14">
   <w:abstractNum w:abstractNumId="0" w15:restartNumberingAfterBreak="0">
     <w:nsid w:val="08572587"/>
     <w:multiLevelType w:val="hybridMultilevel"/>
@@ -10203,25 +10251,25 @@
       </w:pPr>
     </w:lvl>
   </w:abstractNum>
-  <w:num w:numId="1">
+  <w:num w:numId="1" w16cid:durableId="1902060356">
     <w:abstractNumId w:val="5"/>
   </w:num>
-  <w:num w:numId="2">
+  <w:num w:numId="2" w16cid:durableId="1093550454">
     <w:abstractNumId w:val="2"/>
   </w:num>
-  <w:num w:numId="3">
+  <w:num w:numId="3" w16cid:durableId="978612688">
     <w:abstractNumId w:val="0"/>
   </w:num>
-  <w:num w:numId="4">
+  <w:num w:numId="4" w16cid:durableId="666833349">
     <w:abstractNumId w:val="4"/>
   </w:num>
-  <w:num w:numId="5">
+  <w:num w:numId="5" w16cid:durableId="1931618624">
     <w:abstractNumId w:val="1"/>
   </w:num>
-  <w:num w:numId="6">
+  <w:num w:numId="6" w16cid:durableId="1035501063">
     <w:abstractNumId w:val="3"/>
   </w:num>
-  <w:num w:numId="7">
+  <w:num w:numId="7" w16cid:durableId="238831287">
     <w:abstractNumId w:val="3"/>
     <w:lvlOverride w:ilvl="0">
       <w:startOverride w:val="1"/>
@@ -10256,7 +10304,7 @@
 </file>
 
 <file path=word/styles.xml><?xml version="1.0" encoding="utf-8"?>
-<w:styles xmlns:mc="http://schemas.openxmlformats.org/markup-compatibility/2006" xmlns:r="http://schemas.openxmlformats.org/officeDocument/2006/relationships" xmlns:w="http://schemas.openxmlformats.org/wordprocessingml/2006/main" xmlns:w14="http://schemas.microsoft.com/office/word/2010/wordml" xmlns:w15="http://schemas.microsoft.com/office/word/2012/wordml" xmlns:w16cid="http://schemas.microsoft.com/office/word/2016/wordml/cid" xmlns:w16se="http://schemas.microsoft.com/office/word/2015/wordml/symex" mc:Ignorable="w14 w15 w16se w16cid">
+<w:styles xmlns:mc="http://schemas.openxmlformats.org/markup-compatibility/2006" xmlns:r="http://schemas.openxmlformats.org/officeDocument/2006/relationships" xmlns:w="http://schemas.openxmlformats.org/wordprocessingml/2006/main" xmlns:w14="http://schemas.microsoft.com/office/word/2010/wordml" xmlns:w15="http://schemas.microsoft.com/office/word/2012/wordml" xmlns:w16cex="http://schemas.microsoft.com/office/word/2018/wordml/cex" xmlns:w16cid="http://schemas.microsoft.com/office/word/2016/wordml/cid" xmlns:w16="http://schemas.microsoft.com/office/word/2018/wordml" xmlns:w16du="http://schemas.microsoft.com/office/word/2023/wordml/word16du" xmlns:w16sdtdh="http://schemas.microsoft.com/office/word/2020/wordml/sdtdatahash" xmlns:w16sdtfl="http://schemas.microsoft.com/office/word/2024/wordml/sdtformatlock" xmlns:w16se="http://schemas.microsoft.com/office/word/2015/wordml/symex" mc:Ignorable="w14 w15 w16se w16cid w16 w16cex w16sdtdh w16sdtfl w16du">
   <w:docDefaults>
     <w:rPrDefault>
       <w:rPr>
@@ -10272,7 +10320,7 @@
       </w:pPr>
     </w:pPrDefault>
   </w:docDefaults>
-  <w:latentStyles w:defLockedState="0" w:defUIPriority="99" w:defSemiHidden="0" w:defUnhideWhenUsed="0" w:defQFormat="0" w:count="375">
+  <w:latentStyles w:defLockedState="0" w:defUIPriority="99" w:defSemiHidden="0" w:defUnhideWhenUsed="0" w:defQFormat="0" w:count="376">
     <w:lsdException w:name="Normal" w:uiPriority="0" w:qFormat="1"/>
     <w:lsdException w:name="heading 1" w:uiPriority="9" w:qFormat="1"/>
     <w:lsdException w:name="heading 2" w:semiHidden="1" w:uiPriority="9" w:unhideWhenUsed="1" w:qFormat="1"/>
@@ -10427,7 +10475,7 @@
     <w:lsdException w:name="Table Web 2" w:semiHidden="1" w:unhideWhenUsed="1"/>
     <w:lsdException w:name="Table Web 3" w:semiHidden="1" w:unhideWhenUsed="1"/>
     <w:lsdException w:name="Balloon Text" w:semiHidden="1" w:unhideWhenUsed="1"/>
-    <w:lsdException w:name="Table Grid" w:semiHidden="1" w:uiPriority="39" w:unhideWhenUsed="1"/>
+    <w:lsdException w:name="Table Grid" w:uiPriority="39"/>
     <w:lsdException w:name="Table Theme" w:semiHidden="1" w:unhideWhenUsed="1"/>
     <w:lsdException w:name="Placeholder Text" w:semiHidden="1"/>
     <w:lsdException w:name="No Spacing" w:uiPriority="1" w:qFormat="1"/>
@@ -10648,6 +10696,7 @@
     <w:lsdException w:name="Smart Hyperlink" w:semiHidden="1" w:unhideWhenUsed="1"/>
     <w:lsdException w:name="Hashtag" w:semiHidden="1" w:unhideWhenUsed="1"/>
     <w:lsdException w:name="Unresolved Mention" w:semiHidden="1" w:unhideWhenUsed="1"/>
+    <w:lsdException w:name="Smart Link" w:semiHidden="1" w:unhideWhenUsed="1"/>
   </w:latentStyles>
   <w:style w:type="paragraph" w:default="1" w:styleId="Normal">
     <w:name w:val="Normal"/>
@@ -11746,6 +11795,18 @@
       <w:shd w:val="clear" w:color="auto" w:fill="FFFFFF"/>
     </w:rPr>
   </w:style>
+  <w:style w:type="character" w:styleId="UnresolvedMention">
+    <w:name w:val="Unresolved Mention"/>
+    <w:basedOn w:val="DefaultParagraphFont"/>
+    <w:uiPriority w:val="99"/>
+    <w:semiHidden/>
+    <w:unhideWhenUsed/>
+    <w:rsid w:val="00C56A90"/>
+    <w:rPr>
+      <w:color w:val="605E5C"/>
+      <w:shd w:val="clear" w:color="auto" w:fill="E1DFDD"/>
+    </w:rPr>
+  </w:style>
 </w:styles>
 </file>
 

</xml_diff>